<commit_message>
chore/refactoring: brought point property mapping into the API library and cleaned up documentation and some formatting of files.
</commit_message>
<xml_diff>
--- a/development/CSMP_BoundaryRedesign.docx
+++ b/development/CSMP_BoundaryRedesign.docx
@@ -5992,6 +5992,32 @@
     <w:rPr>
       <w:sz w:val="24"/>
       <w:szCs w:val="24"/>
+      <w:lang w:val="en-US" w:eastAsia="en-US"/>
+    </w:rPr>
+  </w:style>
+  <w:style w:type="paragraph" w:styleId="BalloonText">
+    <w:name w:val="Balloon Text"/>
+    <w:basedOn w:val="Normal"/>
+    <w:link w:val="BalloonTextChar"/>
+    <w:uiPriority w:val="99"/>
+    <w:semiHidden/>
+    <w:unhideWhenUsed/>
+    <w:rsid w:val="006D4304"/>
+    <w:rPr>
+      <w:sz w:val="18"/>
+      <w:szCs w:val="18"/>
+    </w:rPr>
+  </w:style>
+  <w:style w:type="character" w:customStyle="1" w:styleId="BalloonTextChar">
+    <w:name w:val="Balloon Text Char"/>
+    <w:basedOn w:val="DefaultParagraphFont"/>
+    <w:link w:val="BalloonText"/>
+    <w:uiPriority w:val="99"/>
+    <w:semiHidden/>
+    <w:rsid w:val="006D4304"/>
+    <w:rPr>
+      <w:sz w:val="18"/>
+      <w:szCs w:val="18"/>
       <w:lang w:val="en-US" w:eastAsia="en-US"/>
     </w:rPr>
   </w:style>

</xml_diff>

<commit_message>
chore: updated the Boundary / SplitBoundary design paper
</commit_message>
<xml_diff>
--- a/development/CSMP_BoundaryRedesign.docx
+++ b/development/CSMP_BoundaryRedesign.docx
@@ -38,30 +38,165 @@
         </w:rPr>
       </w:pPr>
       <w:r>
-        <w:t xml:space="preserve">Outside of CSMP: Boundary construction in ANSYS - split boundaries are created there, get imported into CSMP and matching elements are searched for by post-processing </w:t>
+        <w:rPr>
+          <w:b/>
+          <w:bCs/>
+        </w:rPr>
+        <w:t>Outside of CSMP</w:t>
+      </w:r>
+      <w:r>
+        <w:t xml:space="preserve">: </w:t>
+      </w:r>
+      <w:r>
+        <w:t xml:space="preserve">Lower dimensional </w:t>
+      </w:r>
+      <w:r>
+        <w:t xml:space="preserve">Boundary </w:t>
+      </w:r>
+      <w:r>
+        <w:t xml:space="preserve">objects containing the name string BOUNDARY are defined </w:t>
+      </w:r>
+      <w:r>
+        <w:t xml:space="preserve">in ANSYS </w:t>
+      </w:r>
+      <w:r>
+        <w:t>–</w:t>
+      </w:r>
+      <w:r>
+        <w:t xml:space="preserve"> </w:t>
+      </w:r>
+      <w:r>
+        <w:t xml:space="preserve">bode-matched </w:t>
+      </w:r>
+      <w:r>
+        <w:t>split boundaries</w:t>
+      </w:r>
+      <w:r>
+        <w:t xml:space="preserve"> in a mesh</w:t>
+      </w:r>
+      <w:r>
+        <w:t xml:space="preserve"> </w:t>
+      </w:r>
+      <w:r>
+        <w:t xml:space="preserve">can also be </w:t>
+      </w:r>
+      <w:r>
+        <w:t>created there</w:t>
+      </w:r>
+      <w:r>
+        <w:t xml:space="preserve"> and can then be converted </w:t>
+      </w:r>
+      <w:proofErr w:type="spellStart"/>
+      <w:r>
+        <w:t>into</w:t>
+      </w:r>
+      <w:proofErr w:type="spellEnd"/>
+      <w:r>
+        <w:t xml:space="preserve"> </w:t>
+      </w:r>
+      <w:proofErr w:type="spellStart"/>
+      <w:r>
+        <w:t>SplitBoundary</w:t>
+      </w:r>
+      <w:proofErr w:type="spellEnd"/>
+      <w:r>
+        <w:t xml:space="preserve"> objects inside </w:t>
+      </w:r>
+      <w:r>
+        <w:t xml:space="preserve">CSMP </w:t>
+      </w:r>
+      <w:r>
+        <w:t>following the detection of their</w:t>
+      </w:r>
+      <w:r>
+        <w:t xml:space="preserve"> </w:t>
+      </w:r>
+      <w:r>
+        <w:t>node-</w:t>
+      </w:r>
+      <w:r>
+        <w:t xml:space="preserve">matching elements </w:t>
+      </w:r>
+      <w:r>
+        <w:t xml:space="preserve">by a somewhat costly search algorithm </w:t>
+      </w:r>
+      <w:r>
+        <w:t>post-processing</w:t>
+      </w:r>
+      <w:r>
+        <w:t xml:space="preserve"> the ANSYS mesh</w:t>
+      </w:r>
+      <w:r>
+        <w:t xml:space="preserve"> </w:t>
       </w:r>
       <w:r>
         <w:rPr>
           <w:i/>
           <w:iCs/>
         </w:rPr>
-        <w:t>(use this as a way to unit-test CSMP internal algorithms).</w:t>
-      </w:r>
-    </w:p>
-    <w:p>
-      <w:pPr>
-        <w:pStyle w:val="Body"/>
-      </w:pPr>
-    </w:p>
-    <w:p>
-      <w:pPr>
-        <w:pStyle w:val="Body"/>
-      </w:pPr>
-      <w:r>
-        <w:t>Inside of CSMP: Boundary cons</w:t>
-      </w:r>
-      <w:r>
-        <w:t>truction in 3 different scenarios:</w:t>
+        <w:t xml:space="preserve">(this </w:t>
+      </w:r>
+      <w:r>
+        <w:rPr>
+          <w:i/>
+          <w:iCs/>
+        </w:rPr>
+        <w:t>is one</w:t>
+      </w:r>
+      <w:r>
+        <w:rPr>
+          <w:i/>
+          <w:iCs/>
+        </w:rPr>
+        <w:t xml:space="preserve"> a way </w:t>
+      </w:r>
+      <w:r>
+        <w:rPr>
+          <w:i/>
+          <w:iCs/>
+        </w:rPr>
+        <w:t>how this technology is</w:t>
+      </w:r>
+      <w:r>
+        <w:rPr>
+          <w:i/>
+          <w:iCs/>
+        </w:rPr>
+        <w:t xml:space="preserve"> unit-tes</w:t>
+      </w:r>
+      <w:r>
+        <w:rPr>
+          <w:i/>
+          <w:iCs/>
+        </w:rPr>
+        <w:t>ted inside of CSMP</w:t>
+      </w:r>
+      <w:r>
+        <w:rPr>
+          <w:i/>
+          <w:iCs/>
+        </w:rPr>
+        <w:t>).</w:t>
+      </w:r>
+    </w:p>
+    <w:p>
+      <w:pPr>
+        <w:pStyle w:val="Body"/>
+      </w:pPr>
+    </w:p>
+    <w:p>
+      <w:pPr>
+        <w:pStyle w:val="Body"/>
+      </w:pPr>
+      <w:r>
+        <w:rPr>
+          <w:b/>
+          <w:bCs/>
+        </w:rPr>
+        <w:t>Inside of CSMP</w:t>
+      </w:r>
+      <w:r>
+        <w:t>: Boundary construction in 3 different scenarios:</w:t>
       </w:r>
     </w:p>
     <w:p>
@@ -117,10 +252,7 @@
         <w:spacing w:before="60" w:after="100"/>
       </w:pPr>
       <w:r>
-        <w:t>inside: around a region that is inside or shares only one side with the outside boundary of the mo</w:t>
-      </w:r>
-      <w:r>
-        <w:t>del</w:t>
+        <w:t>inside: around a region that is inside or shares only one side with the outside boundary of the model</w:t>
       </w:r>
     </w:p>
     <w:p>
@@ -240,14 +372,7 @@
           <w:b/>
           <w:bCs/>
         </w:rPr>
-        <w:t>Compute dip and dip dir</w:t>
-      </w:r>
-      <w:r>
-        <w:rPr>
-          <w:b/>
-          <w:bCs/>
-        </w:rPr>
-        <w:t>ection of boundaries</w:t>
+        <w:t>Compute dip and dip direction of boundaries</w:t>
       </w:r>
     </w:p>
     <w:p>
@@ -274,7 +399,33 @@
         <w:t>Conventions</w:t>
       </w:r>
       <w:r>
-        <w:t xml:space="preserve"> that the boundary functionality relies on:</w:t>
+        <w:t xml:space="preserve"> that the </w:t>
+      </w:r>
+      <w:r>
+        <w:t>B</w:t>
+      </w:r>
+      <w:r>
+        <w:t xml:space="preserve">oundary </w:t>
+      </w:r>
+      <w:r>
+        <w:t xml:space="preserve">and </w:t>
+      </w:r>
+      <w:proofErr w:type="spellStart"/>
+      <w:r>
+        <w:t>SplitBoundary</w:t>
+      </w:r>
+      <w:proofErr w:type="spellEnd"/>
+      <w:r>
+        <w:t xml:space="preserve"> </w:t>
+      </w:r>
+      <w:r>
+        <w:t xml:space="preserve">functionality </w:t>
+      </w:r>
+      <w:r>
+        <w:t>is based</w:t>
+      </w:r>
+      <w:r>
+        <w:t xml:space="preserve"> on:</w:t>
       </w:r>
     </w:p>
     <w:p>
@@ -287,15 +438,34 @@
         <w:spacing w:before="60" w:after="100"/>
       </w:pPr>
       <w:r>
-        <w:t xml:space="preserve">Boundaries are dimension </w:t>
-      </w:r>
-      <w:proofErr w:type="gramStart"/>
-      <w:r>
-        <w:t>minus  &gt;</w:t>
-      </w:r>
-      <w:proofErr w:type="gramEnd"/>
-      <w:r>
-        <w:t xml:space="preserve">1 regions (by analogy with the BOX_BOUNDARY naming conventions, edges are also Boundary objects) </w:t>
+        <w:t xml:space="preserve">Like Region, </w:t>
+      </w:r>
+      <w:r>
+        <w:t xml:space="preserve">Boundary and </w:t>
+      </w:r>
+      <w:proofErr w:type="spellStart"/>
+      <w:r>
+        <w:t>SplitBoundary</w:t>
+      </w:r>
+      <w:proofErr w:type="spellEnd"/>
+      <w:r>
+        <w:t xml:space="preserve"> only contain pointers to their Face and </w:t>
+      </w:r>
+      <w:proofErr w:type="spellStart"/>
+      <w:r>
+        <w:t>InterFace</w:t>
+      </w:r>
+      <w:proofErr w:type="spellEnd"/>
+      <w:r>
+        <w:t xml:space="preserve"> objects. The actual objects are stored inside of the </w:t>
+      </w:r>
+      <w:proofErr w:type="spellStart"/>
+      <w:r>
+        <w:t>MeshManager</w:t>
+      </w:r>
+      <w:proofErr w:type="spellEnd"/>
+      <w:r>
+        <w:t>.</w:t>
       </w:r>
     </w:p>
     <w:p>
@@ -308,10 +478,15 @@
         <w:spacing w:before="60" w:after="100"/>
       </w:pPr>
       <w:r>
-        <w:t xml:space="preserve">Nodes know their parent elements, but not their </w:t>
-      </w:r>
-      <w:r>
-        <w:t>parent faces or interfaces</w:t>
+        <w:t xml:space="preserve">Boundaries are dimension </w:t>
+      </w:r>
+      <w:proofErr w:type="gramStart"/>
+      <w:r>
+        <w:t>minus  &gt;</w:t>
+      </w:r>
+      <w:proofErr w:type="gramEnd"/>
+      <w:r>
+        <w:t xml:space="preserve">1 regions (by analogy with the BOX_BOUNDARY naming conventions, edges are also Boundary objects) </w:t>
       </w:r>
     </w:p>
     <w:p>
@@ -323,21 +498,8 @@
         </w:numPr>
         <w:spacing w:before="60" w:after="100"/>
       </w:pPr>
-      <w:proofErr w:type="spellStart"/>
-      <w:r>
-        <w:t>Normals</w:t>
-      </w:r>
-      <w:proofErr w:type="spellEnd"/>
-      <w:r>
-        <w:t xml:space="preserve"> to elements are outward pointing; it follows that the </w:t>
-      </w:r>
-      <w:proofErr w:type="spellStart"/>
-      <w:r>
-        <w:t>normals</w:t>
-      </w:r>
-      <w:proofErr w:type="spellEnd"/>
-      <w:r>
-        <w:t xml:space="preserve"> at the model boundaries are outward pointing as well</w:t>
+      <w:r>
+        <w:t>Nodes know their parent elements, but not their parent faces or interfaces</w:t>
       </w:r>
     </w:p>
     <w:p>
@@ -349,8 +511,13 @@
         </w:numPr>
         <w:spacing w:before="60" w:after="100"/>
       </w:pPr>
-      <w:r>
-        <w:t xml:space="preserve">The </w:t>
+      <w:proofErr w:type="spellStart"/>
+      <w:r>
+        <w:t>Normals</w:t>
+      </w:r>
+      <w:proofErr w:type="spellEnd"/>
+      <w:r>
+        <w:t xml:space="preserve"> to elements are outward pointing; it follows that the </w:t>
       </w:r>
       <w:proofErr w:type="spellStart"/>
       <w:r>
@@ -358,7 +525,50 @@
       </w:r>
       <w:proofErr w:type="spellEnd"/>
       <w:r>
-        <w:t xml:space="preserve"> of Face objects at a boundary point in the same direction</w:t>
+        <w:t xml:space="preserve"> at the model boundaries are outward pointing as well</w:t>
+      </w:r>
+      <w:r>
+        <w:t xml:space="preserve">. Thus, when a boundary is split to create a </w:t>
+      </w:r>
+      <w:proofErr w:type="spellStart"/>
+      <w:r>
+        <w:t>SplitBoundary</w:t>
+      </w:r>
+      <w:proofErr w:type="spellEnd"/>
+      <w:r>
+        <w:t xml:space="preserve">, the higher dimensional elements on either side become located on the outside of the model and the corresponding faces of the </w:t>
+      </w:r>
+      <w:proofErr w:type="spellStart"/>
+      <w:r>
+        <w:t>InterFace</w:t>
+      </w:r>
+      <w:proofErr w:type="spellEnd"/>
+      <w:r>
+        <w:t xml:space="preserve"> object (=building block of the </w:t>
+      </w:r>
+      <w:proofErr w:type="spellStart"/>
+      <w:r>
+        <w:t>SplitBoundary</w:t>
+      </w:r>
+      <w:proofErr w:type="spellEnd"/>
+      <w:r>
+        <w:t xml:space="preserve">) have outward pointing </w:t>
+      </w:r>
+      <w:proofErr w:type="spellStart"/>
+      <w:r>
+        <w:t>normals</w:t>
+      </w:r>
+      <w:proofErr w:type="spellEnd"/>
+      <w:r>
+        <w:t xml:space="preserve"> pointing toward one another. The normal of the </w:t>
+      </w:r>
+      <w:proofErr w:type="spellStart"/>
+      <w:r>
+        <w:t>InterFace</w:t>
+      </w:r>
+      <w:proofErr w:type="spellEnd"/>
+      <w:r>
+        <w:t xml:space="preserve"> however points in the same direction as that of the Face from which it was created from, i.e. from the INSIDE to the OUTSIDE neighbor. </w:t>
       </w:r>
     </w:p>
     <w:p>
@@ -371,10 +581,7 @@
         <w:spacing w:before="60" w:after="100"/>
       </w:pPr>
       <w:r>
-        <w:t xml:space="preserve">On the outside model boundary, Face </w:t>
-      </w:r>
-      <w:r>
-        <w:t xml:space="preserve">objects only have one </w:t>
+        <w:t xml:space="preserve">On the outside model boundary, Face objects only have one </w:t>
       </w:r>
       <w:proofErr w:type="spellStart"/>
       <w:r>
@@ -403,7 +610,49 @@
         <w:spacing w:before="60" w:after="100"/>
       </w:pPr>
       <w:r>
-        <w:t xml:space="preserve">The inside of a Face object lies on the opposite side of where its normal points to </w:t>
+        <w:t xml:space="preserve">The </w:t>
+      </w:r>
+      <w:proofErr w:type="spellStart"/>
+      <w:r>
+        <w:t>normals</w:t>
+      </w:r>
+      <w:proofErr w:type="spellEnd"/>
+      <w:r>
+        <w:t xml:space="preserve"> of Face objects at a </w:t>
+      </w:r>
+      <w:r>
+        <w:t xml:space="preserve">model </w:t>
+      </w:r>
+      <w:r>
+        <w:t>boundary point in the same direction</w:t>
+      </w:r>
+      <w:r>
+        <w:t xml:space="preserve"> as the </w:t>
+      </w:r>
+      <w:proofErr w:type="spellStart"/>
+      <w:r>
+        <w:t>normals</w:t>
+      </w:r>
+      <w:proofErr w:type="spellEnd"/>
+      <w:r>
+        <w:t xml:space="preserve"> of the faces of their INSIDE higher-dimensional neighbors</w:t>
+      </w:r>
+      <w:r>
+        <w:t xml:space="preserve">, </w:t>
+      </w:r>
+      <w:proofErr w:type="gramStart"/>
+      <w:r>
+        <w:t>It</w:t>
+      </w:r>
+      <w:proofErr w:type="gramEnd"/>
+      <w:r>
+        <w:t xml:space="preserve"> follows that t</w:t>
+      </w:r>
+      <w:r>
+        <w:t>he inside of a Face object lies on the opposite side of where its normal points to</w:t>
+      </w:r>
+      <w:r>
+        <w:t>.</w:t>
       </w:r>
     </w:p>
     <w:p>
@@ -416,18 +665,21 @@
         <w:spacing w:before="60" w:after="100"/>
       </w:pPr>
       <w:r>
-        <w:t>If retained, these boundary-parent regions can be con</w:t>
-      </w:r>
-      <w:r>
-        <w:t xml:space="preserve">nected with the newly created Face or </w:t>
-      </w:r>
-      <w:proofErr w:type="spellStart"/>
-      <w:r>
-        <w:t>InterFace</w:t>
-      </w:r>
-      <w:proofErr w:type="spellEnd"/>
-      <w:r>
-        <w:t xml:space="preserve"> objects to achieve additional functionality</w:t>
+        <w:t>Boundaries are decomposed into patches</w:t>
+      </w:r>
+      <w:r>
+        <w:t xml:space="preserve"> dependent on the </w:t>
+      </w:r>
+      <w:proofErr w:type="spellStart"/>
+      <w:r>
+        <w:t>rocktypes</w:t>
+      </w:r>
+      <w:proofErr w:type="spellEnd"/>
+      <w:r>
+        <w:t xml:space="preserve"> that they juxtapose against one another</w:t>
+      </w:r>
+      <w:r>
+        <w:t>; any patch (=sub-boundary) juxtaposes 1 or 2 materials against one another and has a corresponding unique name</w:t>
       </w:r>
     </w:p>
     <w:p>
@@ -440,7 +692,265 @@
         <w:spacing w:before="60" w:after="100"/>
       </w:pPr>
       <w:r>
-        <w:t>Boundaries are decomposed into patches; any patch (=sub-boundary) juxtaposes 1 or 2 materials against one another and has a corresponding unique name</w:t>
+        <w:t xml:space="preserve">The </w:t>
+      </w:r>
+      <w:proofErr w:type="spellStart"/>
+      <w:r>
+        <w:t>f</w:t>
+      </w:r>
+      <w:r>
+        <w:t xml:space="preserve">acing </w:t>
+      </w:r>
+      <w:proofErr w:type="spellEnd"/>
+      <w:r>
+        <w:t xml:space="preserve">relationship </w:t>
+      </w:r>
+      <w:r>
+        <w:t>of boundar</w:t>
+      </w:r>
+      <w:r>
+        <w:t>ies</w:t>
+      </w:r>
+      <w:r>
+        <w:t xml:space="preserve"> in </w:t>
+      </w:r>
+      <w:r>
+        <w:t xml:space="preserve">the parent geologic object </w:t>
+      </w:r>
+      <w:r>
+        <w:t xml:space="preserve">are transferred to the CSMP model and are </w:t>
+      </w:r>
+      <w:r>
+        <w:t>conveyed via the boundary name</w:t>
+      </w:r>
+      <w:r>
+        <w:t xml:space="preserve"> to the </w:t>
+      </w:r>
+      <w:r>
+        <w:t>user</w:t>
+      </w:r>
+      <w:r>
+        <w:t>:</w:t>
+      </w:r>
+    </w:p>
+    <w:p>
+      <w:pPr>
+        <w:pStyle w:val="Body"/>
+        <w:numPr>
+          <w:ilvl w:val="1"/>
+          <w:numId w:val="3"/>
+        </w:numPr>
+        <w:spacing w:before="60" w:after="100"/>
+      </w:pPr>
+      <w:r>
+        <w:t xml:space="preserve">Example: </w:t>
+      </w:r>
+      <w:r>
+        <w:rPr>
+          <w:lang w:val="en-AU"/>
+        </w:rPr>
+        <w:t>NORMAL_FAULT_BOUNDARY2_LAYER_BOTTOM_LAYER_RESERVOIR</w:t>
+      </w:r>
+      <w:r>
+        <w:t xml:space="preserve">: </w:t>
+      </w:r>
+    </w:p>
+    <w:p>
+      <w:pPr>
+        <w:pStyle w:val="Body"/>
+        <w:numPr>
+          <w:ilvl w:val="2"/>
+          <w:numId w:val="3"/>
+        </w:numPr>
+        <w:spacing w:before="60" w:after="100"/>
+      </w:pPr>
+      <w:r>
+        <w:lastRenderedPageBreak/>
+        <w:t xml:space="preserve">Here, </w:t>
+      </w:r>
+      <w:r>
+        <w:rPr>
+          <w:lang w:val="en-AU"/>
+        </w:rPr>
+        <w:t>NORMAL_FAULT</w:t>
+      </w:r>
+      <w:r>
+        <w:t xml:space="preserve"> </w:t>
+      </w:r>
+      <w:r>
+        <w:t xml:space="preserve">is the </w:t>
+      </w:r>
+      <w:r>
+        <w:t xml:space="preserve">lower-dimensional </w:t>
+      </w:r>
+      <w:r>
+        <w:t xml:space="preserve">parent region </w:t>
+      </w:r>
+      <w:r>
+        <w:t>from which the Boundary object was created. In th</w:t>
+      </w:r>
+      <w:r>
+        <w:t>is</w:t>
+      </w:r>
+      <w:r>
+        <w:t xml:space="preserve"> process</w:t>
+      </w:r>
+      <w:r>
+        <w:t xml:space="preserve">, </w:t>
+      </w:r>
+      <w:r>
+        <w:t>the string</w:t>
+      </w:r>
+      <w:r>
+        <w:t xml:space="preserve"> BOUNDARY</w:t>
+      </w:r>
+      <w:r>
+        <w:t xml:space="preserve"> was added to the name</w:t>
+      </w:r>
+      <w:r>
+        <w:t xml:space="preserve"> (</w:t>
+      </w:r>
+      <w:r>
+        <w:t xml:space="preserve">to perform such conversions automatically </w:t>
+      </w:r>
+      <w:r>
+        <w:t>th</w:t>
+      </w:r>
+      <w:r>
+        <w:t>e</w:t>
+      </w:r>
+      <w:r>
+        <w:t xml:space="preserve"> string </w:t>
+      </w:r>
+      <w:r>
+        <w:t xml:space="preserve">“BOUNDARY” </w:t>
+      </w:r>
+      <w:r>
+        <w:t>must be part of the name</w:t>
+      </w:r>
+      <w:r>
+        <w:t xml:space="preserve"> of the input surface</w:t>
+      </w:r>
+      <w:r>
+        <w:t xml:space="preserve">), </w:t>
+      </w:r>
+    </w:p>
+    <w:p>
+      <w:pPr>
+        <w:pStyle w:val="Body"/>
+        <w:numPr>
+          <w:ilvl w:val="2"/>
+          <w:numId w:val="3"/>
+        </w:numPr>
+        <w:spacing w:before="60" w:after="100"/>
+      </w:pPr>
+      <w:r>
+        <w:t xml:space="preserve">the </w:t>
+      </w:r>
+      <w:r>
+        <w:t>number (</w:t>
+      </w:r>
+      <w:r>
+        <w:t>#</w:t>
+      </w:r>
+      <w:r>
+        <w:t>)</w:t>
+      </w:r>
+      <w:r>
+        <w:t xml:space="preserve"> signifies the boundary</w:t>
+      </w:r>
+      <w:r>
+        <w:t xml:space="preserve"> count</w:t>
+      </w:r>
+      <w:r>
+        <w:t xml:space="preserve"> (</w:t>
+      </w:r>
+      <w:r>
+        <w:t>to make sure that the name is</w:t>
+      </w:r>
+      <w:r>
+        <w:t xml:space="preserve"> unique)</w:t>
+      </w:r>
+    </w:p>
+    <w:p>
+      <w:pPr>
+        <w:pStyle w:val="Body"/>
+        <w:numPr>
+          <w:ilvl w:val="2"/>
+          <w:numId w:val="3"/>
+        </w:numPr>
+        <w:spacing w:before="60" w:after="100"/>
+      </w:pPr>
+      <w:r>
+        <w:t xml:space="preserve">the following </w:t>
+      </w:r>
+      <w:r>
+        <w:t>strings</w:t>
+      </w:r>
+      <w:r>
+        <w:t xml:space="preserve"> are </w:t>
+      </w:r>
+      <w:r>
+        <w:t>the names</w:t>
+      </w:r>
+      <w:r>
+        <w:t xml:space="preserve"> of the regions </w:t>
+      </w:r>
+      <w:r>
+        <w:t>juxtaposed by</w:t>
+      </w:r>
+      <w:r>
+        <w:t xml:space="preserve"> the boundary</w:t>
+      </w:r>
+      <w:r>
+        <w:t>; their order</w:t>
+      </w:r>
+      <w:r>
+        <w:t xml:space="preserve"> defin</w:t>
+      </w:r>
+      <w:r>
+        <w:t xml:space="preserve">es the </w:t>
+      </w:r>
+      <w:r>
+        <w:t>facing direction</w:t>
+      </w:r>
+      <w:r>
+        <w:t xml:space="preserve"> of the boundary</w:t>
+      </w:r>
+      <w:r>
+        <w:t>, i.e. t</w:t>
+      </w:r>
+      <w:r>
+        <w:t>he first named region</w:t>
+      </w:r>
+      <w:r>
+        <w:t xml:space="preserve"> “LAYER_BOTTOM”</w:t>
+      </w:r>
+      <w:r>
+        <w:t xml:space="preserve"> is on the inside and the second </w:t>
+      </w:r>
+      <w:r>
+        <w:t>“</w:t>
+      </w:r>
+      <w:r>
+        <w:rPr>
+          <w:lang w:val="en-AU"/>
+        </w:rPr>
+        <w:t>LAYER_RESERVOIR</w:t>
+      </w:r>
+      <w:r>
+        <w:t xml:space="preserve">” is </w:t>
+      </w:r>
+      <w:proofErr w:type="spellStart"/>
+      <w:r>
+        <w:t>n</w:t>
+      </w:r>
+      <w:proofErr w:type="spellEnd"/>
+      <w:r>
+        <w:t xml:space="preserve"> the outside of the boundary</w:t>
+      </w:r>
+      <w:r>
+        <w:t>.</w:t>
       </w:r>
     </w:p>
     <w:p>
@@ -453,87 +963,7 @@
         <w:spacing w:before="60" w:after="100"/>
       </w:pPr>
       <w:r>
-        <w:t>The relationsh</w:t>
-      </w:r>
-      <w:r>
-        <w:t>ip to the parent geologic object is retained and conveyed via the boundary name:</w:t>
-      </w:r>
-    </w:p>
-    <w:p>
-      <w:pPr>
-        <w:pStyle w:val="Body"/>
-        <w:numPr>
-          <w:ilvl w:val="1"/>
-          <w:numId w:val="3"/>
-        </w:numPr>
-        <w:spacing w:before="60" w:after="100"/>
-      </w:pPr>
-      <w:r>
-        <w:t xml:space="preserve">Example: </w:t>
-      </w:r>
-      <w:r>
-        <w:rPr>
-          <w:lang w:val="en-AU"/>
-        </w:rPr>
-        <w:t>NORMAL_FAULT_BOUNDARY2_LAYER_BOTTOM_LAYER_RESERVOIR</w:t>
-      </w:r>
-      <w:r>
-        <w:t xml:space="preserve">: </w:t>
-      </w:r>
-    </w:p>
-    <w:p>
-      <w:pPr>
-        <w:pStyle w:val="Body"/>
-        <w:numPr>
-          <w:ilvl w:val="2"/>
-          <w:numId w:val="3"/>
-        </w:numPr>
-        <w:spacing w:before="60" w:after="100"/>
-      </w:pPr>
-      <w:r>
-        <w:t xml:space="preserve">the normal fault is the parent region of the BOUNDARY (this string must be part of the name), </w:t>
-      </w:r>
-    </w:p>
-    <w:p>
-      <w:pPr>
-        <w:pStyle w:val="Body"/>
-        <w:numPr>
-          <w:ilvl w:val="2"/>
-          <w:numId w:val="3"/>
-        </w:numPr>
-        <w:spacing w:before="60" w:after="100"/>
-      </w:pPr>
-      <w:r>
-        <w:t>the # signifies the number of the boundary (else the name might not be unique)</w:t>
-      </w:r>
-    </w:p>
-    <w:p>
-      <w:pPr>
-        <w:pStyle w:val="Body"/>
-        <w:numPr>
-          <w:ilvl w:val="2"/>
-          <w:numId w:val="3"/>
-        </w:numPr>
-        <w:spacing w:before="60" w:after="100"/>
-      </w:pPr>
-      <w:r>
-        <w:t>the following names are those of the regions adjacent to the boundary, defining it</w:t>
-      </w:r>
-      <w:r>
-        <w:t>s facing direction</w:t>
-      </w:r>
-    </w:p>
-    <w:p>
-      <w:pPr>
-        <w:pStyle w:val="Body"/>
-        <w:numPr>
-          <w:ilvl w:val="2"/>
-          <w:numId w:val="3"/>
-        </w:numPr>
-        <w:spacing w:before="60" w:after="100"/>
-      </w:pPr>
-      <w:r>
-        <w:t>the first named region is on the inside and the second on the outside of the boundary</w:t>
+        <w:t>1D models cannot contain boundaries</w:t>
       </w:r>
     </w:p>
     <w:p>
@@ -546,8 +976,38 @@
         <w:spacing w:before="60" w:after="100"/>
       </w:pPr>
       <w:r>
-        <w:lastRenderedPageBreak/>
-        <w:t>1D models cannot contain boundaries</w:t>
+        <w:t>The existence of Boundary objects is optional, use</w:t>
+      </w:r>
+      <w:r>
+        <w:t xml:space="preserve"> </w:t>
+      </w:r>
+      <w:proofErr w:type="spellStart"/>
+      <w:proofErr w:type="gramStart"/>
+      <w:r>
+        <w:t>model.</w:t>
+      </w:r>
+      <w:r>
+        <w:t>Boundaries</w:t>
+      </w:r>
+      <w:proofErr w:type="spellEnd"/>
+      <w:proofErr w:type="gramEnd"/>
+      <w:r>
+        <w:t xml:space="preserve">() to </w:t>
+      </w:r>
+      <w:r>
+        <w:t>check</w:t>
+      </w:r>
+      <w:r>
+        <w:t xml:space="preserve"> whether </w:t>
+      </w:r>
+      <w:r>
+        <w:t>boundaries</w:t>
+      </w:r>
+      <w:r>
+        <w:t xml:space="preserve"> exist</w:t>
+      </w:r>
+      <w:r>
+        <w:t xml:space="preserve"> in your current model.</w:t>
       </w:r>
     </w:p>
     <w:p>
@@ -560,31 +1020,7 @@
         <w:spacing w:before="60" w:after="100"/>
       </w:pPr>
       <w:r>
-        <w:t xml:space="preserve">The existence of Boundary objects is optional, use </w:t>
-      </w:r>
-      <w:proofErr w:type="gramStart"/>
-      <w:r>
-        <w:t>Boundaries(</w:t>
-      </w:r>
-      <w:proofErr w:type="gramEnd"/>
-      <w:r>
-        <w:t>) to see whether some exist</w:t>
-      </w:r>
-    </w:p>
-    <w:p>
-      <w:pPr>
-        <w:pStyle w:val="Body"/>
-        <w:numPr>
-          <w:ilvl w:val="0"/>
-          <w:numId w:val="3"/>
-        </w:numPr>
-        <w:spacing w:before="60" w:after="100"/>
-      </w:pPr>
-      <w:r>
-        <w:t>Lower-dimensional element</w:t>
-      </w:r>
-      <w:r>
-        <w:t>s within a boundary are part of it. Example: line-elements where surface representations of fractures touch a model boundary.</w:t>
+        <w:t>Lower-dimensional elements within a boundary are part of it. Example: line-elements where surface representations of fractures touch a model boundary.</w:t>
       </w:r>
     </w:p>
     <w:p>
@@ -601,29 +1037,32 @@
         <w:pStyle w:val="Body"/>
         <w:spacing w:before="60" w:after="100"/>
         <w:rPr>
+          <w:b/>
+          <w:bCs/>
           <w:i/>
           <w:iCs/>
           <w:color w:val="FF2600"/>
         </w:rPr>
       </w:pPr>
-    </w:p>
-    <w:p>
-      <w:pPr>
-        <w:pStyle w:val="Body"/>
-        <w:spacing w:before="60" w:after="100"/>
-        <w:rPr>
+      <w:r>
+        <w:rPr>
+          <w:b/>
+          <w:bCs/>
           <w:i/>
           <w:iCs/>
           <w:color w:val="FF2600"/>
         </w:rPr>
-      </w:pPr>
-      <w:r>
-        <w:rPr>
+        <w:t xml:space="preserve">Additional </w:t>
+      </w:r>
+      <w:r>
+        <w:rPr>
+          <w:b/>
+          <w:bCs/>
           <w:i/>
           <w:iCs/>
           <w:color w:val="FF2600"/>
         </w:rPr>
-        <w:t>Notes:</w:t>
+        <w:t>Conventions to be aware of:</w:t>
       </w:r>
     </w:p>
     <w:p>
@@ -636,10 +1075,13 @@
         <w:spacing w:before="60" w:after="100"/>
       </w:pPr>
       <w:r>
-        <w:t xml:space="preserve">The region “Model” which is the default computation domain is non-unique if there are unique regions that </w:t>
-      </w:r>
-      <w:r>
-        <w:t>partition the model</w:t>
+        <w:t>The region “Model” is the default computation domain</w:t>
+      </w:r>
+      <w:r>
+        <w:t xml:space="preserve"> and</w:t>
+      </w:r>
+      <w:r>
+        <w:t xml:space="preserve"> is non-unique if there are unique regions that partition the model</w:t>
       </w:r>
     </w:p>
     <w:p>
@@ -695,10 +1137,13 @@
         <w:t>Assumptions</w:t>
       </w:r>
       <w:r>
-        <w:t xml:space="preserve"> one can rely on when building</w:t>
-      </w:r>
-      <w:r>
-        <w:t xml:space="preserve"> boundaries:</w:t>
+        <w:t xml:space="preserve"> </w:t>
+      </w:r>
+      <w:r>
+        <w:t>we</w:t>
+      </w:r>
+      <w:r>
+        <w:t xml:space="preserve"> rely on when building boundaries:</w:t>
       </w:r>
     </w:p>
     <w:p>
@@ -711,7 +1156,25 @@
         <w:spacing w:before="60" w:after="100"/>
       </w:pPr>
       <w:r>
-        <w:t>Boundary construction from pre-exiting regions can rely on their validity (=correctly identified interior and perimeter, etc.)</w:t>
+        <w:t>Boundary construction from pre-exi</w:t>
+      </w:r>
+      <w:r>
+        <w:t>s</w:t>
+      </w:r>
+      <w:r>
+        <w:t xml:space="preserve">ting regions </w:t>
+      </w:r>
+      <w:r>
+        <w:t>is advantageous because</w:t>
+      </w:r>
+      <w:r>
+        <w:t xml:space="preserve"> their validity </w:t>
+      </w:r>
+      <w:r>
+        <w:t xml:space="preserve">has already been established </w:t>
+      </w:r>
+      <w:r>
+        <w:t>(=correctly identified interior and perimeter, etc.)</w:t>
       </w:r>
     </w:p>
     <w:p>
@@ -729,18 +1192,45 @@
       </w:r>
       <w:proofErr w:type="spellEnd"/>
       <w:r>
-        <w:t xml:space="preserve"> objects are created from Boundary objects to avoid the duplication of functionality. Thus, </w:t>
-      </w:r>
-      <w:proofErr w:type="spellStart"/>
-      <w:r>
-        <w:t>SplitBounda</w:t>
-      </w:r>
-      <w:r>
-        <w:t>ry</w:t>
-      </w:r>
-      <w:proofErr w:type="spellEnd"/>
-      <w:r>
-        <w:t xml:space="preserve"> construction always starts with a valid Boundary object</w:t>
+        <w:t xml:space="preserve"> objects are created from Boundary objects to avoid the duplication of </w:t>
+      </w:r>
+      <w:r>
+        <w:t xml:space="preserve">operations and </w:t>
+      </w:r>
+      <w:r>
+        <w:t>functionality</w:t>
+      </w:r>
+      <w:r>
+        <w:t xml:space="preserve"> of the code</w:t>
+      </w:r>
+      <w:r>
+        <w:t xml:space="preserve">. Thus, </w:t>
+      </w:r>
+      <w:r>
+        <w:t xml:space="preserve">with the exception of split boundaries already present in ANSYS models, within CSMP, </w:t>
+      </w:r>
+      <w:proofErr w:type="spellStart"/>
+      <w:r>
+        <w:t>SplitBoundary</w:t>
+      </w:r>
+      <w:proofErr w:type="spellEnd"/>
+      <w:r>
+        <w:t xml:space="preserve"> construction always starts </w:t>
+      </w:r>
+      <w:r>
+        <w:t>from</w:t>
+      </w:r>
+      <w:r>
+        <w:t xml:space="preserve"> a </w:t>
+      </w:r>
+      <w:r>
+        <w:t>verified</w:t>
+      </w:r>
+      <w:r>
+        <w:t xml:space="preserve"> Boundary object</w:t>
+      </w:r>
+      <w:r>
+        <w:t>.</w:t>
       </w:r>
     </w:p>
     <w:p>
@@ -753,18 +1243,49 @@
         <w:spacing w:before="60" w:after="100"/>
       </w:pPr>
       <w:r>
-        <w:t xml:space="preserve">The </w:t>
-      </w:r>
-      <w:proofErr w:type="spellStart"/>
-      <w:r>
-        <w:t>normals</w:t>
-      </w:r>
-      <w:proofErr w:type="spellEnd"/>
-      <w:r>
-        <w:t xml:space="preserve"> of elements in any lower-dimensional region from which the boundary is constructed all point into the same direction (this can be verified in ANSYS checking the surface orientations of </w:t>
-      </w:r>
-      <w:r>
-        <w:t>the elements); we therefore rely on ANSYS to get this right.</w:t>
+        <w:t>The normal</w:t>
+      </w:r>
+      <w:r>
+        <w:t xml:space="preserve"> orientation</w:t>
+      </w:r>
+      <w:r>
+        <w:t xml:space="preserve"> of elements in any lower-dimensional region from which </w:t>
+      </w:r>
+      <w:r>
+        <w:t>a</w:t>
+      </w:r>
+      <w:r>
+        <w:t xml:space="preserve"> </w:t>
+      </w:r>
+      <w:r>
+        <w:t>B</w:t>
+      </w:r>
+      <w:r>
+        <w:t xml:space="preserve">oundary </w:t>
+      </w:r>
+      <w:r>
+        <w:t xml:space="preserve">was verified when the mesh was </w:t>
+      </w:r>
+      <w:r>
+        <w:t>constructed</w:t>
+      </w:r>
+      <w:r>
+        <w:t>. Therefore, they</w:t>
+      </w:r>
+      <w:r>
+        <w:t xml:space="preserve"> all point into the same </w:t>
+      </w:r>
+      <w:r>
+        <w:t xml:space="preserve">consistent </w:t>
+      </w:r>
+      <w:r>
+        <w:t xml:space="preserve">direction (this can be verified in ANSYS checking the surface orientations of the elements); we </w:t>
+      </w:r>
+      <w:r>
+        <w:t>basically</w:t>
+      </w:r>
+      <w:r>
+        <w:t xml:space="preserve"> rely on ANSYS to get this right.</w:t>
       </w:r>
     </w:p>
     <w:p>
@@ -788,48 +1309,45 @@
     <w:p>
       <w:pPr>
         <w:pStyle w:val="Body"/>
+        <w:rPr>
+          <w:color w:val="929292"/>
+        </w:rPr>
+      </w:pPr>
+    </w:p>
+    <w:p>
+      <w:pPr>
+        <w:pStyle w:val="Body"/>
+      </w:pPr>
+      <w:r>
+        <w:rPr>
+          <w:b/>
+          <w:bCs/>
+        </w:rPr>
+        <w:t>Experience</w:t>
+      </w:r>
+      <w:r>
+        <w:t xml:space="preserve"> shows that:</w:t>
+      </w:r>
+    </w:p>
+    <w:p>
+      <w:pPr>
+        <w:pStyle w:val="Body"/>
         <w:numPr>
           <w:ilvl w:val="0"/>
           <w:numId w:val="3"/>
         </w:numPr>
         <w:spacing w:before="60" w:after="100"/>
-        <w:rPr>
-          <w:color w:val="929292"/>
-        </w:rPr>
-      </w:pPr>
-      <w:r>
-        <w:rPr>
-          <w:color w:val="929292"/>
-        </w:rPr>
-        <w:t>The region “All Elements” contains all elements and nodes except for regions that have already been converted into boundaries and will</w:t>
-      </w:r>
-      <w:r>
-        <w:rPr>
-          <w:color w:val="929292"/>
-        </w:rPr>
-        <w:t xml:space="preserve"> reside in the non-unique regions map. - deprecate - rely on </w:t>
-      </w:r>
-      <w:proofErr w:type="spellStart"/>
-      <w:r>
-        <w:rPr>
-          <w:color w:val="929292"/>
-        </w:rPr>
-        <w:t>MeshManager</w:t>
-      </w:r>
-      <w:proofErr w:type="spellEnd"/>
-      <w:r>
-        <w:rPr>
-          <w:color w:val="929292"/>
-        </w:rPr>
-        <w:t xml:space="preserve"> instead?</w:t>
-      </w:r>
-    </w:p>
-    <w:p>
-      <w:pPr>
-        <w:pStyle w:val="Body"/>
-      </w:pPr>
-      <w:r>
-        <w:t xml:space="preserve">In any case, </w:t>
+      </w:pPr>
+      <w:r>
+        <w:t xml:space="preserve">the segmentation of a boundary by </w:t>
+      </w:r>
+      <w:proofErr w:type="spellStart"/>
+      <w:r>
+        <w:t>neighbouring</w:t>
+      </w:r>
+      <w:proofErr w:type="spellEnd"/>
+      <w:r>
+        <w:t xml:space="preserve"> volumetric regions must be considered.</w:t>
       </w:r>
     </w:p>
     <w:p>
@@ -842,15 +1360,7 @@
         <w:spacing w:before="60" w:after="100"/>
       </w:pPr>
       <w:r>
-        <w:t xml:space="preserve">the segmentation of a boundary by </w:t>
-      </w:r>
-      <w:proofErr w:type="spellStart"/>
-      <w:r>
-        <w:t>neighbouring</w:t>
-      </w:r>
-      <w:proofErr w:type="spellEnd"/>
-      <w:r>
-        <w:t xml:space="preserve"> volumetric regions must be considered.</w:t>
+        <w:t>Boundary names must be unique</w:t>
       </w:r>
     </w:p>
     <w:p>
@@ -863,7 +1373,31 @@
         <w:spacing w:before="60" w:after="100"/>
       </w:pPr>
       <w:r>
-        <w:t>Boundary names must be unique</w:t>
+        <w:t xml:space="preserve">Boundary names must indicate the direction into which the face </w:t>
+      </w:r>
+      <w:proofErr w:type="spellStart"/>
+      <w:r>
+        <w:t>normals</w:t>
+      </w:r>
+      <w:proofErr w:type="spellEnd"/>
+      <w:r>
+        <w:t xml:space="preserve"> point, i.e. where the inside and outside are (inside=first </w:t>
+      </w:r>
+      <w:proofErr w:type="spellStart"/>
+      <w:r>
+        <w:t>neighbour</w:t>
+      </w:r>
+      <w:proofErr w:type="spellEnd"/>
+      <w:r>
+        <w:t xml:space="preserve"> region name - outside second </w:t>
+      </w:r>
+      <w:proofErr w:type="spellStart"/>
+      <w:r>
+        <w:t>neighbour</w:t>
+      </w:r>
+      <w:proofErr w:type="spellEnd"/>
+      <w:r>
+        <w:t xml:space="preserve"> region name)</w:t>
       </w:r>
     </w:p>
     <w:p>
@@ -876,50 +1410,17 @@
         <w:spacing w:before="60" w:after="100"/>
       </w:pPr>
       <w:r>
-        <w:t>Boundary names must indicate the direction i</w:t>
-      </w:r>
-      <w:r>
-        <w:t xml:space="preserve">nto which the face </w:t>
-      </w:r>
-      <w:proofErr w:type="spellStart"/>
-      <w:r>
-        <w:t>normals</w:t>
-      </w:r>
-      <w:proofErr w:type="spellEnd"/>
-      <w:r>
-        <w:t xml:space="preserve"> point, i.e. where the inside and outside are (inside=first </w:t>
-      </w:r>
-      <w:proofErr w:type="spellStart"/>
-      <w:r>
-        <w:t>neighbour</w:t>
-      </w:r>
-      <w:proofErr w:type="spellEnd"/>
-      <w:r>
-        <w:t xml:space="preserve"> region name - outside second </w:t>
-      </w:r>
-      <w:proofErr w:type="spellStart"/>
-      <w:r>
-        <w:t>neighbour</w:t>
-      </w:r>
-      <w:proofErr w:type="spellEnd"/>
-      <w:r>
-        <w:t xml:space="preserve"> region name)</w:t>
-      </w:r>
-    </w:p>
-    <w:p>
-      <w:pPr>
-        <w:pStyle w:val="Body"/>
-        <w:spacing w:before="60" w:after="100"/>
-      </w:pPr>
-      <w:r>
-        <w:t>Fault boundaries (extra functionality):</w:t>
-      </w:r>
-    </w:p>
-    <w:p>
-      <w:pPr>
-        <w:pStyle w:val="Body"/>
-        <w:numPr>
-          <w:ilvl w:val="0"/>
+        <w:t>For f</w:t>
+      </w:r>
+      <w:r>
+        <w:t>ault boundaries (extra functionality):</w:t>
+      </w:r>
+    </w:p>
+    <w:p>
+      <w:pPr>
+        <w:pStyle w:val="Body"/>
+        <w:numPr>
+          <w:ilvl w:val="1"/>
           <w:numId w:val="3"/>
         </w:numPr>
         <w:spacing w:before="60" w:after="100"/>
@@ -940,7 +1441,7 @@
       <w:pPr>
         <w:pStyle w:val="Body"/>
         <w:numPr>
-          <w:ilvl w:val="0"/>
+          <w:ilvl w:val="1"/>
           <w:numId w:val="3"/>
         </w:numPr>
         <w:spacing w:before="60" w:after="100"/>
@@ -963,10 +1464,22 @@
         <w:spacing w:before="60" w:after="100"/>
       </w:pPr>
       <w:r>
-        <w:t>For boundaries with &gt;45o face-</w:t>
-      </w:r>
-      <w:r>
-        <w:t>to-face changes in orientation give the user feedback.</w:t>
+        <w:t>For boundaries with &gt;45</w:t>
+      </w:r>
+      <w:r>
+        <w:rPr>
+          <w:vertAlign w:val="superscript"/>
+        </w:rPr>
+        <w:t>o</w:t>
+      </w:r>
+      <w:r>
+        <w:t xml:space="preserve"> face-to-face changes in orientation the user </w:t>
+      </w:r>
+      <w:r>
+        <w:t>needs to be alerted that something may be going wrong</w:t>
+      </w:r>
+      <w:r>
+        <w:t>.</w:t>
       </w:r>
     </w:p>
     <w:p>
@@ -1011,18 +1524,33 @@
         <w:spacing w:before="60" w:after="100"/>
       </w:pPr>
       <w:r>
-        <w:t>Verify the region object from whic</w:t>
-      </w:r>
-      <w:r>
-        <w:t xml:space="preserve">h the boundary shall be </w:t>
-      </w:r>
-      <w:proofErr w:type="gramStart"/>
-      <w:r>
-        <w:t>created, and</w:t>
-      </w:r>
-      <w:proofErr w:type="gramEnd"/>
-      <w:r>
-        <w:t xml:space="preserve"> diagnose which type of boundary this will become (internal vs. external); determine the number of boundary segments (sub-boundaries) that the new boundary will consist of. The output of this step will be a map of </w:t>
+        <w:t xml:space="preserve">Verify the region object from which the boundary shall be created and </w:t>
+      </w:r>
+    </w:p>
+    <w:p>
+      <w:pPr>
+        <w:pStyle w:val="Body"/>
+        <w:numPr>
+          <w:ilvl w:val="1"/>
+          <w:numId w:val="15"/>
+        </w:numPr>
+        <w:spacing w:before="60" w:after="100"/>
+      </w:pPr>
+      <w:r>
+        <w:t xml:space="preserve">diagnose which type of boundary this will become (internal vs. external); </w:t>
+      </w:r>
+    </w:p>
+    <w:p>
+      <w:pPr>
+        <w:pStyle w:val="Body"/>
+        <w:numPr>
+          <w:ilvl w:val="1"/>
+          <w:numId w:val="15"/>
+        </w:numPr>
+        <w:spacing w:before="60" w:after="100"/>
+      </w:pPr>
+      <w:r>
+        <w:t xml:space="preserve">determine the number of boundary segments (sub-boundaries) that the new boundary will consist of. The output of this step will be a map of </w:t>
       </w:r>
       <w:proofErr w:type="spellStart"/>
       <w:r>
@@ -1030,14 +1558,7 @@
           <w:b/>
           <w:bCs/>
         </w:rPr>
-        <w:t>FaceCo</w:t>
-      </w:r>
-      <w:r>
-        <w:rPr>
-          <w:b/>
-          <w:bCs/>
-        </w:rPr>
-        <w:t>nstructionData</w:t>
+        <w:t>FaceConstructionData</w:t>
       </w:r>
       <w:proofErr w:type="spellEnd"/>
       <w:r>
@@ -1101,10 +1622,7 @@
       </w:r>
       <w:proofErr w:type="spellEnd"/>
       <w:r>
-        <w:t>( std::vector&lt;Face&lt;dim&gt;*&gt;&amp; ); this i</w:t>
-      </w:r>
-      <w:r>
-        <w:t xml:space="preserve">s important because any </w:t>
+        <w:t xml:space="preserve">( std::vector&lt;Face&lt;dim&gt;*&gt;&amp; ); this is important because any </w:t>
       </w:r>
       <w:proofErr w:type="spellStart"/>
       <w:r>
@@ -1125,6 +1643,7 @@
         <w:spacing w:before="60" w:after="100"/>
       </w:pPr>
       <w:r>
+        <w:lastRenderedPageBreak/>
         <w:t>Create the Boundary segments, one-by-one from the map&lt;</w:t>
       </w:r>
       <w:proofErr w:type="spellStart"/>
@@ -1150,10 +1669,7 @@
       </w:r>
       <w:proofErr w:type="spellEnd"/>
       <w:r>
-        <w:t>&gt;; this involves connecting the faces to their hig</w:t>
-      </w:r>
-      <w:r>
-        <w:t xml:space="preserve">her dimensional </w:t>
+        <w:t xml:space="preserve">&gt;; this involves connecting the faces to their higher dimensional </w:t>
       </w:r>
       <w:proofErr w:type="spellStart"/>
       <w:r>
@@ -1174,7 +1690,6 @@
         <w:spacing w:before="60" w:after="100"/>
       </w:pPr>
       <w:r>
-        <w:lastRenderedPageBreak/>
         <w:t xml:space="preserve">If the Face objects were constructed from lower-dimensional Element objects, for the nodes located on the new boundary, </w:t>
       </w:r>
       <w:r>
@@ -1182,14 +1697,7 @@
           <w:i/>
           <w:iCs/>
         </w:rPr>
-        <w:t>recreate the parent element vectors so that they no longer include neither the elements from which the Bound</w:t>
-      </w:r>
-      <w:r>
-        <w:rPr>
-          <w:i/>
-          <w:iCs/>
-        </w:rPr>
-        <w:t>ary was created nor the new faces.</w:t>
+        <w:t>recreate the parent element vectors so that they no longer include neither the elements from which the Boundary was created nor the new faces.</w:t>
       </w:r>
     </w:p>
     <w:p>
@@ -1202,13 +1710,7 @@
         <w:spacing w:before="60" w:after="100"/>
       </w:pPr>
       <w:r>
-        <w:t xml:space="preserve">If it is lower-dimensional, remove the parent region of the boundary from </w:t>
-      </w:r>
-      <w:r>
-        <w:t>“Model”</w:t>
-      </w:r>
-      <w:r>
-        <w:t xml:space="preserve"> and into the non-unique list of regions so that it does not get included into computations.</w:t>
+        <w:t>If it is lower-dimensional, remove the parent region of the boundary from “Model” and into the non-unique list of regions so that it does not get included into computations.</w:t>
       </w:r>
     </w:p>
     <w:p>
@@ -1221,10 +1723,7 @@
         <w:spacing w:before="60" w:after="100"/>
       </w:pPr>
       <w:r>
-        <w:t xml:space="preserve">Assign BOX_BOUNDARY flags to new nodes if </w:t>
-      </w:r>
-      <w:r>
-        <w:t>any.</w:t>
+        <w:t>Assign BOX_BOUNDARY flags to new nodes if any.</w:t>
       </w:r>
     </w:p>
     <w:p>
@@ -1450,8 +1949,21 @@
           <w:sz w:val="16"/>
           <w:szCs w:val="16"/>
         </w:rPr>
-        <w:t xml:space="preserve">    /// moves region to from the unique- to the </w:t>
-      </w:r>
+        <w:t xml:space="preserve">    /// moves region to from the unique- to the non-unique regions map</w:t>
+      </w:r>
+    </w:p>
+    <w:p>
+      <w:pPr>
+        <w:pStyle w:val="Body"/>
+        <w:spacing w:before="60" w:after="100"/>
+        <w:rPr>
+          <w:rFonts w:ascii="Courier" w:eastAsia="Courier" w:hAnsi="Courier" w:cs="Courier"/>
+          <w:b/>
+          <w:bCs/>
+          <w:sz w:val="16"/>
+          <w:szCs w:val="16"/>
+        </w:rPr>
+      </w:pPr>
       <w:r>
         <w:rPr>
           <w:rFonts w:ascii="Courier" w:hAnsi="Courier"/>
@@ -1460,21 +1972,10 @@
           <w:sz w:val="16"/>
           <w:szCs w:val="16"/>
         </w:rPr>
-        <w:t>non-unique regions map</w:t>
-      </w:r>
-    </w:p>
-    <w:p>
-      <w:pPr>
-        <w:pStyle w:val="Body"/>
-        <w:spacing w:before="60" w:after="100"/>
-        <w:rPr>
-          <w:rFonts w:ascii="Courier" w:eastAsia="Courier" w:hAnsi="Courier" w:cs="Courier"/>
-          <w:b/>
-          <w:bCs/>
-          <w:sz w:val="16"/>
-          <w:szCs w:val="16"/>
-        </w:rPr>
-      </w:pPr>
+        <w:t xml:space="preserve">    bool </w:t>
+      </w:r>
+      <w:proofErr w:type="spellStart"/>
+      <w:proofErr w:type="gramStart"/>
       <w:r>
         <w:rPr>
           <w:rFonts w:ascii="Courier" w:hAnsi="Courier"/>
@@ -1483,29 +1984,7 @@
           <w:sz w:val="16"/>
           <w:szCs w:val="16"/>
         </w:rPr>
-        <w:t xml:space="preserve">    bool </w:t>
-      </w:r>
-      <w:proofErr w:type="spellStart"/>
-      <w:proofErr w:type="gramStart"/>
-      <w:r>
-        <w:rPr>
-          <w:rFonts w:ascii="Courier" w:hAnsi="Courier"/>
-          <w:b/>
-          <w:bCs/>
-          <w:sz w:val="16"/>
-          <w:szCs w:val="16"/>
-        </w:rPr>
-        <w:t>MoveTo</w:t>
-      </w:r>
-      <w:r>
-        <w:rPr>
-          <w:rFonts w:ascii="Courier" w:hAnsi="Courier"/>
-          <w:b/>
-          <w:bCs/>
-          <w:sz w:val="16"/>
-          <w:szCs w:val="16"/>
-        </w:rPr>
-        <w:t>Non</w:t>
+        <w:t>MoveToNon</w:t>
       </w:r>
       <w:r>
         <w:rPr>
@@ -1669,13 +2148,7 @@
         <w:rPr>
           <w:color w:val="008F51"/>
         </w:rPr>
-        <w:t>Inter</w:t>
-      </w:r>
-      <w:r>
-        <w:rPr>
-          <w:color w:val="008F51"/>
-        </w:rPr>
-        <w:t>Face</w:t>
+        <w:t>InterFace</w:t>
       </w:r>
       <w:proofErr w:type="spellEnd"/>
       <w:r>
@@ -1746,14 +2219,7 @@
           <w:i/>
           <w:iCs/>
         </w:rPr>
-        <w:t xml:space="preserve">From named pre-existing equidimensional </w:t>
-      </w:r>
-      <w:r>
-        <w:rPr>
-          <w:i/>
-          <w:iCs/>
-        </w:rPr>
-        <w:t>regions</w:t>
+        <w:t>From named pre-existing equidimensional regions</w:t>
       </w:r>
       <w:r>
         <w:t xml:space="preserve">: surfaces and lines, only in 2 or 3D </w:t>
@@ -1837,14 +2303,22 @@
         <w:pStyle w:val="Body"/>
       </w:pPr>
       <w:r>
-        <w:t xml:space="preserve">Former approach encoded into </w:t>
-      </w:r>
-      <w:proofErr w:type="spellStart"/>
-      <w:r>
-        <w:t>RegionInterf</w:t>
-      </w:r>
-      <w:r>
-        <w:t>ace</w:t>
+        <w:t>Former approach encoded in</w:t>
+      </w:r>
+      <w:r>
+        <w:t xml:space="preserve"> the</w:t>
+      </w:r>
+    </w:p>
+    <w:p>
+      <w:pPr>
+        <w:pStyle w:val="Body"/>
+      </w:pPr>
+      <w:r>
+        <w:t xml:space="preserve"> </w:t>
+      </w:r>
+      <w:proofErr w:type="spellStart"/>
+      <w:r>
+        <w:t>RegionInterface</w:t>
       </w:r>
       <w:proofErr w:type="spellEnd"/>
       <w:r>
@@ -1966,59 +2440,73 @@
     </w:p>
     <w:p>
       <w:pPr>
-        <w:pStyle w:val="Heading2"/>
-      </w:pPr>
-      <w:proofErr w:type="spellStart"/>
-      <w:r>
-        <w:t>CreateIn</w:t>
-      </w:r>
-      <w:r>
-        <w:t>ternalBoundaryFrom</w:t>
-      </w:r>
-      <w:proofErr w:type="spellEnd"/>
-      <w:r>
-        <w:t xml:space="preserve"> (lower dimensional region)</w:t>
-      </w:r>
-    </w:p>
-    <w:p>
-      <w:pPr>
-        <w:pStyle w:val="Body"/>
-      </w:pPr>
-      <w:proofErr w:type="spellStart"/>
-      <w:proofErr w:type="gramStart"/>
-      <w:r>
-        <w:t>CreateInternalBoundaryFrom</w:t>
-      </w:r>
-      <w:proofErr w:type="spellEnd"/>
-      <w:r>
-        <w:t>(</w:t>
-      </w:r>
-      <w:proofErr w:type="gramEnd"/>
-      <w:r>
-        <w:t xml:space="preserve">) </w:t>
-      </w:r>
-      <w:r>
-        <w:rPr>
-          <w:color w:val="008E00"/>
-        </w:rPr>
-        <w:t>implemented by SKM 6/2016,</w:t>
-      </w:r>
-      <w:r>
-        <w:t xml:space="preserve"> </w:t>
-      </w:r>
-    </w:p>
-    <w:p>
-      <w:pPr>
-        <w:pStyle w:val="Body"/>
-      </w:pPr>
-      <w:r>
-        <w:t xml:space="preserve">test case in </w:t>
-      </w:r>
-      <w:proofErr w:type="spellStart"/>
-      <w:r>
-        <w:rPr>
+        <w:rPr>
+          <w:rFonts w:ascii="Helvetica" w:hAnsi="Helvetica" w:cs="Arial Unicode MS"/>
           <w:b/>
           <w:bCs/>
+          <w:color w:val="000000"/>
+          <w:sz w:val="32"/>
+          <w:szCs w:val="32"/>
+          <w:lang w:eastAsia="en-GB"/>
+        </w:rPr>
+      </w:pPr>
+      <w:r>
+        <w:br w:type="page"/>
+      </w:r>
+    </w:p>
+    <w:p>
+      <w:pPr>
+        <w:pStyle w:val="Heading2"/>
+      </w:pPr>
+      <w:proofErr w:type="spellStart"/>
+      <w:r>
+        <w:lastRenderedPageBreak/>
+        <w:t>CreateInternalBoundaryFrom</w:t>
+      </w:r>
+      <w:proofErr w:type="spellEnd"/>
+      <w:r>
+        <w:t xml:space="preserve"> (lower dimensional region)</w:t>
+      </w:r>
+    </w:p>
+    <w:p>
+      <w:pPr>
+        <w:pStyle w:val="Body"/>
+      </w:pPr>
+      <w:proofErr w:type="spellStart"/>
+      <w:proofErr w:type="gramStart"/>
+      <w:r>
+        <w:t>CreateInternalBoundaryFrom</w:t>
+      </w:r>
+      <w:proofErr w:type="spellEnd"/>
+      <w:r>
+        <w:t>(</w:t>
+      </w:r>
+      <w:proofErr w:type="gramEnd"/>
+      <w:r>
+        <w:t xml:space="preserve">) </w:t>
+      </w:r>
+      <w:r>
+        <w:rPr>
+          <w:color w:val="008E00"/>
+        </w:rPr>
+        <w:t>implemented by SKM 6/2016,</w:t>
+      </w:r>
+      <w:r>
+        <w:t xml:space="preserve"> </w:t>
+      </w:r>
+    </w:p>
+    <w:p>
+      <w:pPr>
+        <w:pStyle w:val="Body"/>
+      </w:pPr>
+      <w:r>
+        <w:t xml:space="preserve">test case in </w:t>
+      </w:r>
+      <w:proofErr w:type="spellStart"/>
+      <w:r>
+        <w:rPr>
+          <w:b/>
+          <w:bCs/>
         </w:rPr>
         <w:t>BoundaryInterface_Test</w:t>
       </w:r>
@@ -2034,7 +2522,6 @@
         <w:pStyle w:val="Ccode"/>
       </w:pPr>
       <w:r>
-        <w:lastRenderedPageBreak/>
         <w:t xml:space="preserve">Use node-to-parent relationship to find the higher dimensional elements that will share a face with the Face:  use    </w:t>
       </w:r>
       <w:proofErr w:type="spellStart"/>
@@ -2087,10 +2574,7 @@
         <w:spacing w:before="60" w:after="100"/>
       </w:pPr>
       <w:r>
-        <w:t>Verify input lower-dimensional region object from which the boundary shall be created: must be lower dimensi</w:t>
-      </w:r>
-      <w:r>
-        <w:t xml:space="preserve">onal and must lie inside of model </w:t>
+        <w:t xml:space="preserve">Verify input lower-dimensional region object from which the boundary shall be created: must be lower dimensional and must lie inside of model </w:t>
       </w:r>
     </w:p>
     <w:p>
@@ -2179,10 +2663,7 @@
       </w:r>
       <w:proofErr w:type="spellEnd"/>
       <w:r>
-        <w:t xml:space="preserve"> creation relies on this connectivity </w:t>
-      </w:r>
-      <w:r>
-        <w:t>during identification of interior and perimeter.</w:t>
+        <w:t xml:space="preserve"> creation relies on this connectivity during identification of interior and perimeter.</w:t>
       </w:r>
     </w:p>
     <w:p>
@@ -2241,10 +2722,7 @@
         <w:spacing w:before="60" w:after="100"/>
       </w:pPr>
       <w:r>
-        <w:t>If the Face objects were constructed from lower-</w:t>
-      </w:r>
-      <w:r>
-        <w:t>dimensional Elements - for nodes located on the new boundary - update / recreate the parent element vectors so that these no longer include neither the elements from which the Boundary was created nor the new faces.</w:t>
+        <w:t>If the Face objects were constructed from lower-dimensional Elements - for nodes located on the new boundary - update / recreate the parent element vectors so that these no longer include neither the elements from which the Boundary was created nor the new faces.</w:t>
       </w:r>
     </w:p>
     <w:p>
@@ -2257,16 +2735,7 @@
         <w:spacing w:before="60" w:after="100"/>
       </w:pPr>
       <w:r>
-        <w:t>Remove the parent region of the boundary</w:t>
-      </w:r>
-      <w:r>
-        <w:t xml:space="preserve"> from </w:t>
-      </w:r>
-      <w:r>
-        <w:t>“Model”</w:t>
-      </w:r>
-      <w:r>
-        <w:t xml:space="preserve"> and into the non-unique list of regions so that it does not get included into computations.</w:t>
+        <w:t>Remove the parent region of the boundary from “Model” and into the non-unique list of regions so that it does not get included into computations.</w:t>
       </w:r>
     </w:p>
     <w:p>
@@ -2316,869 +2785,50 @@
     <w:p>
       <w:pPr>
         <w:pStyle w:val="Heading2"/>
+        <w:rPr>
+          <w:color w:val="808080" w:themeColor="background1" w:themeShade="80"/>
+        </w:rPr>
       </w:pPr>
       <w:proofErr w:type="spellStart"/>
       <w:proofErr w:type="gramStart"/>
       <w:r>
+        <w:rPr>
+          <w:color w:val="808080" w:themeColor="background1" w:themeShade="80"/>
+        </w:rPr>
         <w:t>CreateBetween</w:t>
       </w:r>
       <w:proofErr w:type="spellEnd"/>
       <w:r>
+        <w:rPr>
+          <w:color w:val="808080" w:themeColor="background1" w:themeShade="80"/>
+        </w:rPr>
         <w:t>( const</w:t>
       </w:r>
       <w:proofErr w:type="gramEnd"/>
       <w:r>
+        <w:rPr>
+          <w:color w:val="808080" w:themeColor="background1" w:themeShade="80"/>
+        </w:rPr>
         <w:t xml:space="preserve"> char* </w:t>
       </w:r>
       <w:proofErr w:type="spellStart"/>
       <w:r>
+        <w:rPr>
+          <w:color w:val="808080" w:themeColor="background1" w:themeShade="80"/>
+        </w:rPr>
         <w:t>inside_vol</w:t>
       </w:r>
       <w:proofErr w:type="spellEnd"/>
       <w:r>
+        <w:rPr>
+          <w:color w:val="808080" w:themeColor="background1" w:themeShade="80"/>
+        </w:rPr>
         <w:t>, const char* outside )</w:t>
       </w:r>
     </w:p>
     <w:p>
       <w:pPr>
         <w:pStyle w:val="Body"/>
-        <w:rPr>
-          <w:color w:val="FF2600"/>
-        </w:rPr>
-      </w:pPr>
-      <w:r>
-        <w:rPr>
-          <w:color w:val="FF2600"/>
-        </w:rPr>
-        <w:t>To be refactored.</w:t>
-      </w:r>
-    </w:p>
-    <w:p>
-      <w:pPr>
-        <w:pStyle w:val="Body"/>
-      </w:pPr>
-    </w:p>
-    <w:p>
-      <w:pPr>
-        <w:pStyle w:val="Body"/>
-      </w:pPr>
-      <w:r>
-        <w:t>Conditions to check:</w:t>
-      </w:r>
-    </w:p>
-    <w:p>
-      <w:pPr>
-        <w:pStyle w:val="Body"/>
-        <w:numPr>
-          <w:ilvl w:val="0"/>
-          <w:numId w:val="3"/>
-        </w:numPr>
-        <w:spacing w:before="60" w:after="100"/>
-      </w:pPr>
-      <w:r>
-        <w:t>form Boundary from unique regions only (space exclusive regions only)</w:t>
-      </w:r>
-    </w:p>
-    <w:p>
-      <w:pPr>
-        <w:pStyle w:val="Body"/>
-        <w:numPr>
-          <w:ilvl w:val="0"/>
-          <w:numId w:val="3"/>
-        </w:numPr>
-        <w:spacing w:before="60" w:after="100"/>
-      </w:pPr>
-      <w:r>
-        <w:t xml:space="preserve">the resulting boundary will be inside the model; therefore, each Face must have 2 higher dimensional </w:t>
-      </w:r>
-      <w:proofErr w:type="spellStart"/>
-      <w:r>
-        <w:t>neig</w:t>
-      </w:r>
-      <w:r>
-        <w:t>hbours</w:t>
-      </w:r>
-      <w:proofErr w:type="spellEnd"/>
-      <w:r>
-        <w:t xml:space="preserve"> </w:t>
-      </w:r>
-    </w:p>
-    <w:p>
-      <w:pPr>
-        <w:pStyle w:val="Body"/>
-      </w:pPr>
-    </w:p>
-    <w:p>
-      <w:pPr>
-        <w:pStyle w:val="Body"/>
-      </w:pPr>
-      <w:r>
-        <w:t>Construction:</w:t>
-      </w:r>
-    </w:p>
-    <w:p>
-      <w:pPr>
-        <w:pStyle w:val="Body"/>
-        <w:numPr>
-          <w:ilvl w:val="0"/>
-          <w:numId w:val="8"/>
-        </w:numPr>
-        <w:spacing w:before="60" w:after="100"/>
-      </w:pPr>
-      <w:r>
-        <w:t xml:space="preserve">Find elements that are shared between the 2 unique target regions, if any: issue WARNING and return if the regions do not touch or interpenetrate each other (use method of </w:t>
-      </w:r>
-      <w:proofErr w:type="spellStart"/>
-      <w:r>
-        <w:t>RegionInterface</w:t>
-      </w:r>
-      <w:proofErr w:type="spellEnd"/>
-      <w:r>
-        <w:t xml:space="preserve"> to determine this), Consider only the </w:t>
-      </w:r>
-      <w:r>
-        <w:t>perimeter faces of elements in the adjacent regions.</w:t>
-      </w:r>
-    </w:p>
-    <w:p>
-      <w:pPr>
-        <w:pStyle w:val="Body"/>
-        <w:numPr>
-          <w:ilvl w:val="1"/>
-          <w:numId w:val="5"/>
-        </w:numPr>
-        <w:spacing w:before="60" w:after="100"/>
-      </w:pPr>
-      <w:proofErr w:type="spellStart"/>
-      <w:r>
-        <w:t>size_t</w:t>
-      </w:r>
-      <w:proofErr w:type="spellEnd"/>
-      <w:r>
-        <w:t xml:space="preserve"> </w:t>
-      </w:r>
-      <w:proofErr w:type="spellStart"/>
-      <w:r>
-        <w:t>sharedPerimeter</w:t>
-      </w:r>
-      <w:r>
-        <w:t>Nodes</w:t>
-      </w:r>
-      <w:proofErr w:type="spellEnd"/>
-      <w:r>
-        <w:t>(</w:t>
-      </w:r>
-      <w:proofErr w:type="spellStart"/>
-      <w:proofErr w:type="gramStart"/>
-      <w:r>
-        <w:t>subdomain,subdomain</w:t>
-      </w:r>
-      <w:proofErr w:type="spellEnd"/>
-      <w:proofErr w:type="gramEnd"/>
-      <w:r>
-        <w:t>) may be a quick way to check whether regions touch each other</w:t>
-      </w:r>
-    </w:p>
-    <w:p>
-      <w:pPr>
-        <w:pStyle w:val="Body"/>
-        <w:numPr>
-          <w:ilvl w:val="0"/>
-          <w:numId w:val="5"/>
-        </w:numPr>
-        <w:spacing w:before="60" w:after="100"/>
-      </w:pPr>
-      <w:r>
-        <w:t xml:space="preserve">Find the touching faces of the contacting elements and create </w:t>
-      </w:r>
-      <w:proofErr w:type="spellStart"/>
-      <w:r>
-        <w:rPr>
-          <w:b/>
-          <w:bCs/>
-        </w:rPr>
-        <w:t>FaceConstructionData</w:t>
-      </w:r>
-      <w:proofErr w:type="spellEnd"/>
-      <w:r>
-        <w:t xml:space="preserve"> object fro</w:t>
-      </w:r>
-      <w:r>
-        <w:t>m them</w:t>
-      </w:r>
-    </w:p>
-    <w:p>
-      <w:pPr>
-        <w:pStyle w:val="Body"/>
-        <w:numPr>
-          <w:ilvl w:val="1"/>
-          <w:numId w:val="3"/>
-        </w:numPr>
-        <w:spacing w:before="60" w:after="100"/>
-      </w:pPr>
-      <w:r>
-        <w:t>decide which way the normal should point; start with region that shall become the inside. It will be the one passed as first argument to the method</w:t>
-      </w:r>
-    </w:p>
-    <w:p>
-      <w:pPr>
-        <w:pStyle w:val="Body"/>
-        <w:numPr>
-          <w:ilvl w:val="1"/>
-          <w:numId w:val="3"/>
-        </w:numPr>
-        <w:spacing w:before="60" w:after="100"/>
-      </w:pPr>
-      <w:r>
-        <w:lastRenderedPageBreak/>
-        <w:t xml:space="preserve">the node numbering of the Face objects will be in the same sense of orientation as that of the nodes </w:t>
-      </w:r>
-      <w:r>
-        <w:t>of the faces of the volumetric elements on the inside</w:t>
-      </w:r>
-    </w:p>
-    <w:p>
-      <w:pPr>
-        <w:pStyle w:val="Body"/>
-        <w:numPr>
-          <w:ilvl w:val="1"/>
-          <w:numId w:val="3"/>
-        </w:numPr>
-        <w:spacing w:before="60" w:after="100"/>
-      </w:pPr>
-      <w:r>
-        <w:t>Thus, the normal will point from the first to the second of the volumetric parent regions</w:t>
-      </w:r>
-    </w:p>
-    <w:p>
-      <w:pPr>
-        <w:pStyle w:val="Body"/>
-        <w:numPr>
-          <w:ilvl w:val="0"/>
-          <w:numId w:val="5"/>
-        </w:numPr>
-        <w:spacing w:before="60" w:after="100"/>
-      </w:pPr>
-      <w:r>
-        <w:t xml:space="preserve">Build Face objects in </w:t>
-      </w:r>
-      <w:proofErr w:type="spellStart"/>
-      <w:r>
-        <w:t>MeshManager</w:t>
-      </w:r>
-      <w:proofErr w:type="spellEnd"/>
-      <w:r>
-        <w:t xml:space="preserve"> and interconnect them</w:t>
-      </w:r>
-    </w:p>
-    <w:p>
-      <w:pPr>
-        <w:pStyle w:val="Body"/>
-        <w:numPr>
-          <w:ilvl w:val="0"/>
-          <w:numId w:val="5"/>
-        </w:numPr>
-        <w:spacing w:before="60" w:after="100"/>
-      </w:pPr>
-      <w:r>
-        <w:rPr>
-          <w:color w:val="919191"/>
-        </w:rPr>
-        <w:t>An update of the node connectivity is not necessary beca</w:t>
-      </w:r>
-      <w:r>
-        <w:rPr>
-          <w:color w:val="919191"/>
-        </w:rPr>
-        <w:t>use faces do not belong to node parents</w:t>
-      </w:r>
-      <w:r>
-        <w:t xml:space="preserve"> </w:t>
-      </w:r>
-    </w:p>
-    <w:p>
-      <w:pPr>
-        <w:pStyle w:val="Body"/>
-      </w:pPr>
-    </w:p>
-    <w:p>
-      <w:pPr>
-        <w:pStyle w:val="Body"/>
-      </w:pPr>
-    </w:p>
-    <w:p>
-      <w:pPr>
-        <w:pStyle w:val="Heading2"/>
-      </w:pPr>
-      <w:proofErr w:type="spellStart"/>
-      <w:proofErr w:type="gramStart"/>
-      <w:r>
-        <w:t>CreateAround</w:t>
-      </w:r>
-      <w:proofErr w:type="spellEnd"/>
-      <w:r>
-        <w:t>(</w:t>
-      </w:r>
-      <w:proofErr w:type="gramEnd"/>
-      <w:r>
-        <w:t>volumetric region)</w:t>
-      </w:r>
-    </w:p>
-    <w:p>
-      <w:pPr>
-        <w:pStyle w:val="Body"/>
-      </w:pPr>
-      <w:r>
-        <w:t>Not implemented yet, but needed for model and any volumetric region inside</w:t>
-      </w:r>
-    </w:p>
-    <w:p>
-      <w:pPr>
-        <w:pStyle w:val="Body"/>
-      </w:pPr>
-      <w:r>
-        <w:t>2 options:</w:t>
-      </w:r>
-    </w:p>
-    <w:p>
-      <w:pPr>
-        <w:pStyle w:val="Body"/>
-      </w:pPr>
-    </w:p>
-    <w:p>
-      <w:pPr>
-        <w:pStyle w:val="Body"/>
-        <w:numPr>
-          <w:ilvl w:val="0"/>
-          <w:numId w:val="9"/>
-        </w:numPr>
-        <w:spacing w:before="60" w:after="100"/>
-      </w:pPr>
-      <w:r>
-        <w:t>outside: around model; this must work even if the volumetric region is non-unique</w:t>
-      </w:r>
-    </w:p>
-    <w:p>
-      <w:pPr>
-        <w:pStyle w:val="Body"/>
-        <w:numPr>
-          <w:ilvl w:val="0"/>
-          <w:numId w:val="9"/>
-        </w:numPr>
-        <w:spacing w:before="60" w:after="100"/>
-      </w:pPr>
-      <w:r>
-        <w:t xml:space="preserve">inside: </w:t>
-      </w:r>
-      <w:r>
-        <w:t>around a region that is inside or shares only one side with the outside boundary of the model</w:t>
-      </w:r>
-    </w:p>
-    <w:p>
-      <w:pPr>
-        <w:pStyle w:val="Body"/>
-        <w:spacing w:before="60" w:after="100"/>
-        <w:rPr>
-          <w:b/>
-          <w:bCs/>
-        </w:rPr>
-      </w:pPr>
-    </w:p>
-    <w:p>
-      <w:pPr>
-        <w:pStyle w:val="Body"/>
-      </w:pPr>
-    </w:p>
-    <w:p>
-      <w:pPr>
-        <w:pStyle w:val="Body"/>
-      </w:pPr>
-    </w:p>
-    <w:p>
-      <w:pPr>
-        <w:pStyle w:val="Body"/>
-      </w:pPr>
-    </w:p>
-    <w:p>
-      <w:pPr>
-        <w:pStyle w:val="Heading2"/>
-      </w:pPr>
-      <w:r>
-        <w:t>Edge Objects</w:t>
-      </w:r>
-    </w:p>
-    <w:p>
-      <w:pPr>
-        <w:pStyle w:val="Body"/>
-        <w:rPr>
-          <w:color w:val="FF2600"/>
-        </w:rPr>
-      </w:pPr>
-      <w:r>
-        <w:rPr>
-          <w:color w:val="FF2600"/>
-        </w:rPr>
-        <w:t>Are such entities (dim-2) elements needed? - if so, only a 3D implementation is needed.</w:t>
-      </w:r>
-    </w:p>
-    <w:p>
-      <w:pPr>
-        <w:pStyle w:val="Body"/>
-      </w:pPr>
-    </w:p>
-    <w:p>
-      <w:pPr>
-        <w:pStyle w:val="Body"/>
-      </w:pPr>
-      <w:r>
-        <w:t xml:space="preserve">Dimension-2 elements that sit between </w:t>
-      </w:r>
-      <w:r>
-        <w:t>boundaries.</w:t>
-      </w:r>
-    </w:p>
-    <w:p>
-      <w:pPr>
-        <w:pStyle w:val="Body"/>
-      </w:pPr>
-      <w:r>
-        <w:t xml:space="preserve">2 options:  </w:t>
-      </w:r>
-      <w:proofErr w:type="spellStart"/>
-      <w:proofErr w:type="gramStart"/>
-      <w:r>
-        <w:t>FormFrom</w:t>
-      </w:r>
-      <w:proofErr w:type="spellEnd"/>
-      <w:r>
-        <w:t>(</w:t>
-      </w:r>
-      <w:proofErr w:type="gramEnd"/>
-      <w:r>
-        <w:t xml:space="preserve">line elements),  </w:t>
-      </w:r>
-      <w:proofErr w:type="spellStart"/>
-      <w:r>
-        <w:t>InsertBetween</w:t>
-      </w:r>
-      <w:proofErr w:type="spellEnd"/>
-      <w:r>
-        <w:t>()  boundaries that share an edge (detect)</w:t>
-      </w:r>
-    </w:p>
-    <w:p>
-      <w:pPr>
-        <w:pStyle w:val="Body"/>
-      </w:pPr>
-      <w:r>
-        <w:t>For the efficient assignment of boundary conditions.</w:t>
-      </w:r>
-    </w:p>
-    <w:p>
-      <w:pPr>
-        <w:pStyle w:val="Body"/>
-      </w:pPr>
-    </w:p>
-    <w:p>
-      <w:pPr>
-        <w:pStyle w:val="Body"/>
-      </w:pPr>
-    </w:p>
-    <w:p>
-      <w:pPr>
-        <w:pStyle w:val="Heading2"/>
-      </w:pPr>
-      <w:r>
-        <w:t>All Calculations</w:t>
-      </w:r>
-    </w:p>
-    <w:p>
-      <w:pPr>
-        <w:pStyle w:val="Body"/>
-      </w:pPr>
-    </w:p>
-    <w:p>
-      <w:pPr>
-        <w:pStyle w:val="Body"/>
-      </w:pPr>
-      <w:r>
-        <w:t xml:space="preserve">Add </w:t>
-      </w:r>
-      <w:r>
-        <w:rPr>
-          <w:b/>
-          <w:bCs/>
-        </w:rPr>
-        <w:t>conversion constructor</w:t>
-      </w:r>
-      <w:r>
-        <w:t xml:space="preserve"> to </w:t>
-      </w:r>
-      <w:proofErr w:type="gramStart"/>
-      <w:r>
-        <w:t>Face  so</w:t>
-      </w:r>
-      <w:proofErr w:type="gramEnd"/>
-      <w:r>
-        <w:t xml:space="preserve"> it can be constructed from surface/lin</w:t>
-      </w:r>
-      <w:r>
-        <w:t>e element</w:t>
-      </w:r>
-    </w:p>
-    <w:p>
-      <w:pPr>
-        <w:pStyle w:val="Body"/>
-      </w:pPr>
-    </w:p>
-    <w:p>
-      <w:pPr>
-        <w:pStyle w:val="Body"/>
-      </w:pPr>
-      <w:r>
-        <w:t>Accumulate ALL the lower-dimensional elements that shall be removed first and then use Scott Meyers erase(</w:t>
-      </w:r>
-      <w:proofErr w:type="gramStart"/>
-      <w:r>
-        <w:t>remove(</w:t>
-      </w:r>
-      <w:proofErr w:type="gramEnd"/>
-      <w:r>
-        <w:t>)) paradigm,</w:t>
-      </w:r>
-    </w:p>
-    <w:p>
-      <w:pPr>
-        <w:pStyle w:val="Body"/>
-      </w:pPr>
-    </w:p>
-    <w:p>
-      <w:pPr>
-        <w:pStyle w:val="Body"/>
-      </w:pPr>
-    </w:p>
-    <w:p>
-      <w:pPr>
-        <w:pStyle w:val="HeadingRed"/>
-      </w:pPr>
-      <w:r>
-        <w:t>Issues &amp; Bug Fixes</w:t>
-      </w:r>
-    </w:p>
-    <w:p>
-      <w:pPr>
-        <w:pStyle w:val="Body"/>
-      </w:pPr>
-    </w:p>
-    <w:p>
-      <w:pPr>
-        <w:pStyle w:val="Body"/>
-      </w:pPr>
-      <w:r>
-        <w:t>The “All Elements” region may not be needed anymore; check and eliminate if possible</w:t>
-      </w:r>
-    </w:p>
-    <w:p>
-      <w:pPr>
-        <w:pStyle w:val="Body"/>
-      </w:pPr>
-    </w:p>
-    <w:p>
-      <w:pPr>
-        <w:pStyle w:val="Body"/>
-      </w:pPr>
-      <w:r>
-        <w:t>When lower-</w:t>
-      </w:r>
-      <w:r>
-        <w:t>dimensional regions are decomposed in boundary patches each of these has a perimeter around them. The only way to get the perimeter of the original surface is by retaining it in the computations.</w:t>
-      </w:r>
-    </w:p>
-    <w:p>
-      <w:pPr>
-        <w:pStyle w:val="Body"/>
-        <w:spacing w:before="60" w:after="100"/>
-      </w:pPr>
-      <w:r>
-        <w:t xml:space="preserve">Code cleanup: </w:t>
-      </w:r>
-    </w:p>
-    <w:p>
-      <w:pPr>
-        <w:pStyle w:val="Body"/>
-        <w:numPr>
-          <w:ilvl w:val="0"/>
-          <w:numId w:val="11"/>
-        </w:numPr>
-        <w:spacing w:before="60" w:after="100"/>
-        <w:rPr>
-          <w:color w:val="D9D9D9" w:themeColor="background1" w:themeShade="D9"/>
-        </w:rPr>
-      </w:pPr>
-      <w:r>
-        <w:rPr>
-          <w:color w:val="D9D9D9" w:themeColor="background1" w:themeShade="D9"/>
-        </w:rPr>
-        <w:t xml:space="preserve">remove </w:t>
-      </w:r>
-      <w:proofErr w:type="spellStart"/>
-      <w:r>
-        <w:rPr>
-          <w:color w:val="D9D9D9" w:themeColor="background1" w:themeShade="D9"/>
-        </w:rPr>
-        <w:t>ElementRemeshingTraits</w:t>
-      </w:r>
-      <w:proofErr w:type="spellEnd"/>
-      <w:r>
-        <w:rPr>
-          <w:color w:val="D9D9D9" w:themeColor="background1" w:themeShade="D9"/>
-        </w:rPr>
-        <w:t xml:space="preserve"> from Element. I</w:t>
-      </w:r>
-      <w:r>
-        <w:rPr>
-          <w:color w:val="D9D9D9" w:themeColor="background1" w:themeShade="D9"/>
-        </w:rPr>
-        <w:t xml:space="preserve">t does not add needed capabilities and rests on the misunderstanding that </w:t>
-      </w:r>
-      <w:proofErr w:type="spellStart"/>
-      <w:r>
-        <w:rPr>
-          <w:color w:val="D9D9D9" w:themeColor="background1" w:themeShade="D9"/>
-        </w:rPr>
-        <w:t>ModelSubDomain</w:t>
-      </w:r>
-      <w:proofErr w:type="spellEnd"/>
-      <w:r>
-        <w:rPr>
-          <w:color w:val="D9D9D9" w:themeColor="background1" w:themeShade="D9"/>
-        </w:rPr>
-        <w:t xml:space="preserve"> manage their Element and Node objects. </w:t>
-      </w:r>
-    </w:p>
-    <w:p>
-      <w:pPr>
-        <w:pStyle w:val="Body"/>
-        <w:numPr>
-          <w:ilvl w:val="0"/>
-          <w:numId w:val="11"/>
-        </w:numPr>
-        <w:spacing w:before="60" w:after="100"/>
-        <w:rPr>
-          <w:color w:val="D9D9D9" w:themeColor="background1" w:themeShade="D9"/>
-        </w:rPr>
-      </w:pPr>
-      <w:r>
-        <w:rPr>
-          <w:color w:val="D9D9D9" w:themeColor="background1" w:themeShade="D9"/>
-        </w:rPr>
-        <w:t xml:space="preserve">Mark questionable functions and methods for deprecation; </w:t>
-      </w:r>
-    </w:p>
-    <w:p>
-      <w:pPr>
-        <w:pStyle w:val="Body"/>
-        <w:numPr>
-          <w:ilvl w:val="0"/>
-          <w:numId w:val="11"/>
-        </w:numPr>
-        <w:spacing w:before="60" w:after="100"/>
-      </w:pPr>
-      <w:r>
-        <w:t>W</w:t>
-      </w:r>
-      <w:r>
-        <w:rPr>
-          <w:color w:val="FF2600"/>
-        </w:rPr>
-        <w:t xml:space="preserve">hy is </w:t>
-      </w:r>
-      <w:proofErr w:type="spellStart"/>
-      <w:proofErr w:type="gramStart"/>
-      <w:r>
-        <w:rPr>
-          <w:color w:val="FF2600"/>
-        </w:rPr>
-        <w:t>ModelSubDomain</w:t>
-      </w:r>
-      <w:proofErr w:type="spellEnd"/>
-      <w:r>
-        <w:rPr>
-          <w:color w:val="FF2600"/>
-        </w:rPr>
-        <w:t>::</w:t>
-      </w:r>
-      <w:proofErr w:type="spellStart"/>
-      <w:proofErr w:type="gramEnd"/>
-      <w:r>
-        <w:rPr>
-          <w:color w:val="FF2600"/>
-        </w:rPr>
-        <w:t>EstablishNeighborConnectivity</w:t>
-      </w:r>
-      <w:proofErr w:type="spellEnd"/>
-      <w:r>
-        <w:rPr>
-          <w:color w:val="FF2600"/>
-        </w:rPr>
-        <w:t xml:space="preserve">() sensitive to </w:t>
-      </w:r>
-      <w:proofErr w:type="spellStart"/>
-      <w:r>
-        <w:rPr>
-          <w:color w:val="FF2600"/>
-        </w:rPr>
-        <w:t>M</w:t>
-      </w:r>
-      <w:r>
-        <w:rPr>
-          <w:color w:val="FF2600"/>
-        </w:rPr>
-        <w:t>eshManager</w:t>
-      </w:r>
-      <w:proofErr w:type="spellEnd"/>
-      <w:r>
-        <w:rPr>
-          <w:color w:val="FF2600"/>
-        </w:rPr>
-        <w:t>::</w:t>
-      </w:r>
-      <w:proofErr w:type="spellStart"/>
-      <w:r>
-        <w:rPr>
-          <w:color w:val="FF2600"/>
-        </w:rPr>
-        <w:t>InitialiseConnectivity</w:t>
-      </w:r>
-      <w:proofErr w:type="spellEnd"/>
-      <w:r>
-        <w:rPr>
-          <w:color w:val="FF2600"/>
-        </w:rPr>
-        <w:t>(), section 3 on neighbors.</w:t>
-      </w:r>
-    </w:p>
-    <w:p>
-      <w:pPr>
-        <w:pStyle w:val="Body"/>
-        <w:numPr>
-          <w:ilvl w:val="0"/>
-          <w:numId w:val="11"/>
-        </w:numPr>
-        <w:spacing w:before="60" w:after="100"/>
-        <w:rPr>
-          <w:color w:val="D9D9D9" w:themeColor="background1" w:themeShade="D9"/>
-        </w:rPr>
-      </w:pPr>
-      <w:r>
-        <w:rPr>
-          <w:color w:val="D9D9D9" w:themeColor="background1" w:themeShade="D9"/>
-        </w:rPr>
-        <w:lastRenderedPageBreak/>
-        <w:t>Test removal of regions</w:t>
-      </w:r>
-    </w:p>
-    <w:p>
-      <w:pPr>
-        <w:pStyle w:val="Body"/>
-        <w:numPr>
-          <w:ilvl w:val="0"/>
-          <w:numId w:val="11"/>
-        </w:numPr>
-        <w:spacing w:before="60" w:after="100"/>
-      </w:pPr>
-      <w:r>
-        <w:t xml:space="preserve">Remove all </w:t>
-      </w:r>
-      <w:proofErr w:type="spellStart"/>
-      <w:r>
-        <w:t>stand alone</w:t>
-      </w:r>
-      <w:proofErr w:type="spellEnd"/>
-      <w:r>
-        <w:t xml:space="preserve"> </w:t>
-      </w:r>
-      <w:proofErr w:type="spellStart"/>
-      <w:r>
-        <w:t>establishNeighborConnectivity</w:t>
-      </w:r>
-      <w:proofErr w:type="spellEnd"/>
-      <w:r>
-        <w:t xml:space="preserve"> functions from high level utilities</w:t>
-      </w:r>
-    </w:p>
-    <w:p>
-      <w:pPr>
-        <w:pStyle w:val="Body"/>
-        <w:numPr>
-          <w:ilvl w:val="0"/>
-          <w:numId w:val="11"/>
-        </w:numPr>
-        <w:spacing w:before="60" w:after="100"/>
-      </w:pPr>
-      <w:r>
-        <w:t xml:space="preserve">Check for code duplication and move code common to Region, Boundary and </w:t>
-      </w:r>
-      <w:proofErr w:type="spellStart"/>
-      <w:r>
-        <w:t>SplitBoun</w:t>
-      </w:r>
-      <w:r>
-        <w:t>dary</w:t>
-      </w:r>
-      <w:proofErr w:type="spellEnd"/>
-      <w:r>
-        <w:t xml:space="preserve"> down into </w:t>
-      </w:r>
-      <w:proofErr w:type="spellStart"/>
-      <w:r>
-        <w:t>ModelSubDomain</w:t>
-      </w:r>
-      <w:proofErr w:type="spellEnd"/>
-    </w:p>
-    <w:p>
-      <w:pPr>
-        <w:pStyle w:val="HeadingRed"/>
-      </w:pPr>
-      <w:r>
-        <w:t>To do:</w:t>
-      </w:r>
-    </w:p>
-    <w:p>
-      <w:pPr>
-        <w:pStyle w:val="Body"/>
-        <w:numPr>
-          <w:ilvl w:val="0"/>
-          <w:numId w:val="3"/>
-        </w:numPr>
-        <w:spacing w:before="60" w:after="100"/>
-        <w:rPr>
-          <w:color w:val="FF2600"/>
-        </w:rPr>
-      </w:pPr>
-      <w:r>
-        <w:rPr>
-          <w:i/>
-          <w:iCs/>
-          <w:color w:val="008F51"/>
-        </w:rPr>
-        <w:t>Have a convention for the deletion of lower-dimensional regions that were converted into boundaries</w:t>
-      </w:r>
-      <w:r>
-        <w:rPr>
-          <w:color w:val="FF2600"/>
-        </w:rPr>
-        <w:t>.</w:t>
-      </w:r>
-    </w:p>
-    <w:p>
-      <w:pPr>
-        <w:pStyle w:val="Body"/>
-        <w:numPr>
-          <w:ilvl w:val="0"/>
-          <w:numId w:val="12"/>
-        </w:numPr>
-        <w:spacing w:before="60" w:after="100"/>
         <w:rPr>
           <w:i/>
           <w:iCs/>
@@ -3191,7 +2841,7 @@
           <w:iCs/>
           <w:color w:val="FF2600"/>
         </w:rPr>
-        <w:t xml:space="preserve">Removed lower-dim regions must not be part of any computational domain anymore (not-just non-unique regions). This </w:t>
+        <w:t xml:space="preserve">To be </w:t>
       </w:r>
       <w:r>
         <w:rPr>
@@ -3199,42 +2849,359 @@
           <w:iCs/>
           <w:color w:val="FF2600"/>
         </w:rPr>
-        <w:t>includes the removal of these elements from the parent-element node list of other elements.</w:t>
-      </w:r>
-    </w:p>
-    <w:p>
-      <w:pPr>
-        <w:pStyle w:val="Body"/>
-        <w:numPr>
-          <w:ilvl w:val="0"/>
-          <w:numId w:val="12"/>
-        </w:numPr>
-        <w:spacing w:before="60" w:after="100"/>
+        <w:t>deprecated</w:t>
+      </w:r>
+      <w:r>
         <w:rPr>
           <w:i/>
           <w:iCs/>
           <w:color w:val="FF2600"/>
         </w:rPr>
-      </w:pPr>
+        <w:t xml:space="preserve"> unless there is a good reason like a speed advantage to keep this</w:t>
+      </w:r>
       <w:r>
         <w:rPr>
           <w:i/>
           <w:iCs/>
           <w:color w:val="FF2600"/>
         </w:rPr>
-        <w:t>Check whether the “All Elements” region is still needed</w:t>
-      </w:r>
-    </w:p>
-    <w:p>
-      <w:pPr>
-        <w:pStyle w:val="Body"/>
-        <w:spacing w:before="60" w:after="100"/>
+        <w:t>.</w:t>
+      </w:r>
+    </w:p>
+    <w:p>
+      <w:pPr>
+        <w:pStyle w:val="Body"/>
+      </w:pPr>
+    </w:p>
+    <w:p>
+      <w:pPr>
+        <w:pStyle w:val="Body"/>
+      </w:pPr>
+      <w:r>
+        <w:t>Conditions to check:</w:t>
+      </w:r>
+    </w:p>
+    <w:p>
+      <w:pPr>
+        <w:pStyle w:val="Body"/>
+        <w:numPr>
+          <w:ilvl w:val="0"/>
+          <w:numId w:val="3"/>
+        </w:numPr>
+        <w:spacing w:before="60" w:after="100"/>
+      </w:pPr>
+      <w:r>
+        <w:t>form Boundary from unique regions only (space exclusive regions only)</w:t>
+      </w:r>
+    </w:p>
+    <w:p>
+      <w:pPr>
+        <w:pStyle w:val="Body"/>
+        <w:numPr>
+          <w:ilvl w:val="0"/>
+          <w:numId w:val="3"/>
+        </w:numPr>
+        <w:spacing w:before="60" w:after="100"/>
+      </w:pPr>
+      <w:r>
+        <w:t xml:space="preserve">the resulting boundary will be inside the model; therefore, each Face must have 2 higher dimensional </w:t>
+      </w:r>
+      <w:proofErr w:type="spellStart"/>
+      <w:r>
+        <w:t>neighbours</w:t>
+      </w:r>
+      <w:proofErr w:type="spellEnd"/>
+      <w:r>
+        <w:t xml:space="preserve"> </w:t>
+      </w:r>
+    </w:p>
+    <w:p>
+      <w:pPr>
+        <w:pStyle w:val="Body"/>
+      </w:pPr>
+    </w:p>
+    <w:p>
+      <w:pPr>
+        <w:pStyle w:val="Body"/>
+      </w:pPr>
+      <w:r>
+        <w:t>Construction:</w:t>
+      </w:r>
+    </w:p>
+    <w:p>
+      <w:pPr>
+        <w:pStyle w:val="Body"/>
+        <w:numPr>
+          <w:ilvl w:val="0"/>
+          <w:numId w:val="8"/>
+        </w:numPr>
+        <w:spacing w:before="60" w:after="100"/>
+      </w:pPr>
+      <w:r>
+        <w:t xml:space="preserve">Find elements that are shared between the 2 unique target regions, if any: issue WARNING and return if the regions do not touch or interpenetrate each other (use method of </w:t>
+      </w:r>
+      <w:proofErr w:type="spellStart"/>
+      <w:r>
+        <w:t>RegionInterface</w:t>
+      </w:r>
+      <w:proofErr w:type="spellEnd"/>
+      <w:r>
+        <w:t xml:space="preserve"> to determine this), Consider only the perimeter faces of elements in the adjacent regions.</w:t>
+      </w:r>
+    </w:p>
+    <w:p>
+      <w:pPr>
+        <w:pStyle w:val="Body"/>
+        <w:numPr>
+          <w:ilvl w:val="1"/>
+          <w:numId w:val="5"/>
+        </w:numPr>
+        <w:spacing w:before="60" w:after="100"/>
+      </w:pPr>
+      <w:proofErr w:type="spellStart"/>
+      <w:r>
+        <w:t>size_t</w:t>
+      </w:r>
+      <w:proofErr w:type="spellEnd"/>
+      <w:r>
+        <w:t xml:space="preserve"> </w:t>
+      </w:r>
+      <w:proofErr w:type="spellStart"/>
+      <w:r>
+        <w:t>sharedPerimeterNodes</w:t>
+      </w:r>
+      <w:proofErr w:type="spellEnd"/>
+      <w:r>
+        <w:t>(</w:t>
+      </w:r>
+      <w:proofErr w:type="spellStart"/>
+      <w:proofErr w:type="gramStart"/>
+      <w:r>
+        <w:t>subdomain,subdomain</w:t>
+      </w:r>
+      <w:proofErr w:type="spellEnd"/>
+      <w:proofErr w:type="gramEnd"/>
+      <w:r>
+        <w:t>) may be a quick way to check whether regions touch each other</w:t>
+      </w:r>
+    </w:p>
+    <w:p>
+      <w:pPr>
+        <w:pStyle w:val="Body"/>
+        <w:numPr>
+          <w:ilvl w:val="0"/>
+          <w:numId w:val="5"/>
+        </w:numPr>
+        <w:spacing w:before="60" w:after="100"/>
+      </w:pPr>
+      <w:r>
+        <w:t xml:space="preserve">Find the touching faces of the contacting elements and create </w:t>
+      </w:r>
+      <w:proofErr w:type="spellStart"/>
+      <w:r>
+        <w:rPr>
+          <w:b/>
+          <w:bCs/>
+        </w:rPr>
+        <w:t>FaceConstructionData</w:t>
+      </w:r>
+      <w:proofErr w:type="spellEnd"/>
+      <w:r>
+        <w:t xml:space="preserve"> object from them</w:t>
+      </w:r>
+    </w:p>
+    <w:p>
+      <w:pPr>
+        <w:pStyle w:val="Body"/>
+        <w:numPr>
+          <w:ilvl w:val="1"/>
+          <w:numId w:val="3"/>
+        </w:numPr>
+        <w:spacing w:before="60" w:after="100"/>
+      </w:pPr>
+      <w:r>
+        <w:lastRenderedPageBreak/>
+        <w:t>decide which way the normal should point; start with region that shall become the inside. It will be the one passed as first argument to the method</w:t>
+      </w:r>
+    </w:p>
+    <w:p>
+      <w:pPr>
+        <w:pStyle w:val="Body"/>
+        <w:numPr>
+          <w:ilvl w:val="1"/>
+          <w:numId w:val="3"/>
+        </w:numPr>
+        <w:spacing w:before="60" w:after="100"/>
+      </w:pPr>
+      <w:r>
+        <w:t>the node numbering of the Face objects will be in the same sense of orientation as that of the nodes of the faces of the volumetric elements on the inside</w:t>
+      </w:r>
+    </w:p>
+    <w:p>
+      <w:pPr>
+        <w:pStyle w:val="Body"/>
+        <w:numPr>
+          <w:ilvl w:val="1"/>
+          <w:numId w:val="3"/>
+        </w:numPr>
+        <w:spacing w:before="60" w:after="100"/>
+      </w:pPr>
+      <w:r>
+        <w:t>Thus, the normal will point from the first to the second of the volumetric parent regions</w:t>
+      </w:r>
+    </w:p>
+    <w:p>
+      <w:pPr>
+        <w:pStyle w:val="Body"/>
+        <w:numPr>
+          <w:ilvl w:val="0"/>
+          <w:numId w:val="5"/>
+        </w:numPr>
+        <w:spacing w:before="60" w:after="100"/>
+      </w:pPr>
+      <w:r>
+        <w:t xml:space="preserve">Build Face objects in </w:t>
+      </w:r>
+      <w:proofErr w:type="spellStart"/>
+      <w:r>
+        <w:t>MeshManager</w:t>
+      </w:r>
+      <w:proofErr w:type="spellEnd"/>
+      <w:r>
+        <w:t xml:space="preserve"> and interconnect them</w:t>
+      </w:r>
+    </w:p>
+    <w:p>
+      <w:pPr>
+        <w:pStyle w:val="Body"/>
+        <w:numPr>
+          <w:ilvl w:val="0"/>
+          <w:numId w:val="5"/>
+        </w:numPr>
+        <w:spacing w:before="60" w:after="100"/>
+      </w:pPr>
+      <w:r>
+        <w:rPr>
+          <w:color w:val="919191"/>
+        </w:rPr>
+        <w:t>An update of the node connectivity is not necessary because faces do not belong to node parents</w:t>
+      </w:r>
+      <w:r>
+        <w:t xml:space="preserve"> </w:t>
+      </w:r>
+    </w:p>
+    <w:p>
+      <w:pPr>
+        <w:pStyle w:val="Body"/>
+      </w:pPr>
+    </w:p>
+    <w:p>
+      <w:pPr>
+        <w:pStyle w:val="Body"/>
+      </w:pPr>
+    </w:p>
+    <w:p>
+      <w:pPr>
+        <w:pStyle w:val="Heading2"/>
+        <w:rPr>
+          <w:color w:val="808080" w:themeColor="background1" w:themeShade="80"/>
+        </w:rPr>
+      </w:pPr>
+      <w:r>
+        <w:rPr>
+          <w:color w:val="808080" w:themeColor="background1" w:themeShade="80"/>
+        </w:rPr>
+        <w:t>Edge Objects</w:t>
+      </w:r>
+    </w:p>
+    <w:p>
+      <w:pPr>
+        <w:pStyle w:val="Body"/>
         <w:rPr>
           <w:i/>
           <w:iCs/>
           <w:color w:val="FF2600"/>
         </w:rPr>
       </w:pPr>
+      <w:r>
+        <w:rPr>
+          <w:i/>
+          <w:iCs/>
+          <w:color w:val="FF2600"/>
+        </w:rPr>
+        <w:t xml:space="preserve">Are such entities (dim-2) elements needed? - if so, only a 3D implementation </w:t>
+      </w:r>
+      <w:r>
+        <w:rPr>
+          <w:i/>
+          <w:iCs/>
+          <w:color w:val="FF2600"/>
+        </w:rPr>
+        <w:t>would be needed to represent the boundaries of boundaries? – At present, I cannot see a need for them</w:t>
+      </w:r>
+      <w:r>
+        <w:rPr>
+          <w:i/>
+          <w:iCs/>
+          <w:color w:val="FF2600"/>
+        </w:rPr>
+        <w:t>.</w:t>
+      </w:r>
+    </w:p>
+    <w:p>
+      <w:pPr>
+        <w:pStyle w:val="Body"/>
+      </w:pPr>
+    </w:p>
+    <w:p>
+      <w:pPr>
+        <w:pStyle w:val="Body"/>
+      </w:pPr>
+      <w:r>
+        <w:t>Dimension-2 elements that sit between boundaries.</w:t>
+      </w:r>
+    </w:p>
+    <w:p>
+      <w:pPr>
+        <w:pStyle w:val="Body"/>
+      </w:pPr>
+      <w:r>
+        <w:t xml:space="preserve">2 options:  </w:t>
+      </w:r>
+      <w:proofErr w:type="spellStart"/>
+      <w:proofErr w:type="gramStart"/>
+      <w:r>
+        <w:t>FormFrom</w:t>
+      </w:r>
+      <w:proofErr w:type="spellEnd"/>
+      <w:r>
+        <w:t>(</w:t>
+      </w:r>
+      <w:proofErr w:type="gramEnd"/>
+      <w:r>
+        <w:t xml:space="preserve">line elements),  </w:t>
+      </w:r>
+      <w:proofErr w:type="spellStart"/>
+      <w:r>
+        <w:t>InsertBetween</w:t>
+      </w:r>
+      <w:proofErr w:type="spellEnd"/>
+      <w:r>
+        <w:t>()  boundaries that share an edge (detect)</w:t>
+      </w:r>
+    </w:p>
+    <w:p>
+      <w:pPr>
+        <w:pStyle w:val="Body"/>
+      </w:pPr>
+      <w:r>
+        <w:t>For the efficient assignment of boundary conditions.</w:t>
+      </w:r>
+    </w:p>
+    <w:p>
+      <w:pPr>
+        <w:pStyle w:val="Body"/>
+      </w:pPr>
     </w:p>
     <w:p>
       <w:pPr>
@@ -3246,17 +3213,63 @@
         <w:pStyle w:val="HeadingRed"/>
       </w:pPr>
       <w:r>
-        <w:t>Development Strategy</w:t>
-      </w:r>
-    </w:p>
-    <w:p>
-      <w:pPr>
-        <w:pStyle w:val="Body"/>
-      </w:pPr>
-    </w:p>
-    <w:p>
-      <w:pPr>
-        <w:pStyle w:val="Body"/>
+        <w:t>Issues &amp; Bug Fixes</w:t>
+      </w:r>
+    </w:p>
+    <w:p>
+      <w:pPr>
+        <w:pStyle w:val="Body"/>
+      </w:pPr>
+    </w:p>
+    <w:p>
+      <w:pPr>
+        <w:pStyle w:val="Body"/>
+      </w:pPr>
+      <w:r>
+        <w:t>When lower-dimensional regions are decomposed in boundary patches</w:t>
+      </w:r>
+      <w:r>
+        <w:t>,</w:t>
+      </w:r>
+      <w:r>
+        <w:t xml:space="preserve"> each </w:t>
+      </w:r>
+      <w:r>
+        <w:t>patch will have</w:t>
+      </w:r>
+      <w:r>
+        <w:t xml:space="preserve"> a perimeter. The only way to </w:t>
+      </w:r>
+      <w:r>
+        <w:t>find</w:t>
+      </w:r>
+      <w:r>
+        <w:t xml:space="preserve"> th</w:t>
+      </w:r>
+      <w:r>
+        <w:t>is</w:t>
+      </w:r>
+      <w:r>
+        <w:t xml:space="preserve"> perimeter of the original surface is by retaining it in the computations.</w:t>
+      </w:r>
+    </w:p>
+    <w:p>
+      <w:pPr>
+        <w:pStyle w:val="Body"/>
+        <w:spacing w:before="60" w:after="100"/>
+      </w:pPr>
+      <w:r>
+        <w:t xml:space="preserve">Code cleanup: </w:t>
+      </w:r>
+    </w:p>
+    <w:p>
+      <w:pPr>
+        <w:pStyle w:val="Body"/>
+        <w:numPr>
+          <w:ilvl w:val="0"/>
+          <w:numId w:val="11"/>
+        </w:numPr>
+        <w:spacing w:before="60" w:after="100"/>
       </w:pPr>
       <w:proofErr w:type="spellStart"/>
       <w:proofErr w:type="gramStart"/>
@@ -3269,88 +3282,162 @@
       </w:r>
       <w:proofErr w:type="gramEnd"/>
       <w:r>
-        <w:t>) - done</w:t>
-      </w:r>
-    </w:p>
-    <w:p>
-      <w:pPr>
-        <w:pStyle w:val="Body"/>
-      </w:pPr>
+        <w:t xml:space="preserve">) – needs a 2D </w:t>
+      </w:r>
+      <w:proofErr w:type="spellStart"/>
+      <w:r>
+        <w:t>specialisation</w:t>
+      </w:r>
+      <w:proofErr w:type="spellEnd"/>
+    </w:p>
+    <w:p>
+      <w:pPr>
+        <w:pStyle w:val="Body"/>
+        <w:numPr>
+          <w:ilvl w:val="0"/>
+          <w:numId w:val="11"/>
+        </w:numPr>
+        <w:spacing w:before="60" w:after="100"/>
+      </w:pPr>
+      <w:r>
+        <w:t>W</w:t>
+      </w:r>
+      <w:r>
+        <w:rPr>
+          <w:color w:val="FF2600"/>
+        </w:rPr>
+        <w:t xml:space="preserve">hy is </w:t>
+      </w:r>
       <w:proofErr w:type="spellStart"/>
       <w:proofErr w:type="gramStart"/>
       <w:r>
-        <w:t>CreateBetween</w:t>
-      </w:r>
-      <w:proofErr w:type="spellEnd"/>
-      <w:r>
-        <w:t>(</w:t>
-      </w:r>
+        <w:rPr>
+          <w:color w:val="FF2600"/>
+        </w:rPr>
+        <w:t>ModelSubDomain</w:t>
+      </w:r>
+      <w:proofErr w:type="spellEnd"/>
+      <w:r>
+        <w:rPr>
+          <w:color w:val="FF2600"/>
+        </w:rPr>
+        <w:t>::</w:t>
+      </w:r>
+      <w:proofErr w:type="spellStart"/>
       <w:proofErr w:type="gramEnd"/>
       <w:r>
-        <w:t>)</w:t>
-      </w:r>
-    </w:p>
-    <w:p>
-      <w:pPr>
-        <w:pStyle w:val="Body"/>
-      </w:pPr>
-      <w:proofErr w:type="spellStart"/>
-      <w:proofErr w:type="gramStart"/>
-      <w:r>
-        <w:t>CreateAround</w:t>
-      </w:r>
-      <w:proofErr w:type="spellEnd"/>
-      <w:r>
-        <w:t>(</w:t>
-      </w:r>
-      <w:proofErr w:type="gramEnd"/>
-      <w:r>
-        <w:t>) - seems to be ver</w:t>
-      </w:r>
-      <w:r>
-        <w:t>y hard, sequential approach needed</w:t>
-      </w:r>
-    </w:p>
-    <w:p>
-      <w:pPr>
-        <w:pStyle w:val="Body"/>
-      </w:pPr>
-    </w:p>
-    <w:p>
-      <w:pPr>
-        <w:pStyle w:val="Body"/>
-      </w:pPr>
-      <w:r>
-        <w:t>1. Write function that identifies boundary patches and unique boundary names</w:t>
-      </w:r>
-    </w:p>
-    <w:p>
-      <w:pPr>
-        <w:pStyle w:val="Body"/>
-      </w:pPr>
-    </w:p>
-    <w:p>
-      <w:pPr>
-        <w:pStyle w:val="Body"/>
-      </w:pPr>
-      <w:r>
-        <w:t>1.a - Use a node-based way of identifying which adjacent higher dimensional elements inside the volumetric mesh share faces with the lower-dim</w:t>
-      </w:r>
-      <w:r>
-        <w:t>ensional regions</w:t>
-      </w:r>
-    </w:p>
-    <w:p>
-      <w:pPr>
-        <w:pStyle w:val="Body"/>
-      </w:pPr>
-    </w:p>
-    <w:p>
-      <w:pPr>
-        <w:pStyle w:val="Body"/>
-      </w:pPr>
-      <w:r>
-        <w:t xml:space="preserve">1.b identify the inside and outside parent elements by way of normal directions: if the normal of their corresponding face yields a negative projection, the element is on the outside; else inside. </w:t>
+        <w:rPr>
+          <w:color w:val="FF2600"/>
+        </w:rPr>
+        <w:t>EstablishNeighborConnectivity</w:t>
+      </w:r>
+      <w:proofErr w:type="spellEnd"/>
+      <w:r>
+        <w:rPr>
+          <w:color w:val="FF2600"/>
+        </w:rPr>
+        <w:t xml:space="preserve">() sensitive to </w:t>
+      </w:r>
+      <w:proofErr w:type="spellStart"/>
+      <w:r>
+        <w:rPr>
+          <w:color w:val="FF2600"/>
+        </w:rPr>
+        <w:t>MeshManager</w:t>
+      </w:r>
+      <w:proofErr w:type="spellEnd"/>
+      <w:r>
+        <w:rPr>
+          <w:color w:val="FF2600"/>
+        </w:rPr>
+        <w:t>::</w:t>
+      </w:r>
+      <w:proofErr w:type="spellStart"/>
+      <w:r>
+        <w:rPr>
+          <w:color w:val="FF2600"/>
+        </w:rPr>
+        <w:t>InitialiseConnectivity</w:t>
+      </w:r>
+      <w:proofErr w:type="spellEnd"/>
+      <w:r>
+        <w:rPr>
+          <w:color w:val="FF2600"/>
+        </w:rPr>
+        <w:t>(), section 3 on neighbors.</w:t>
+      </w:r>
+    </w:p>
+    <w:p>
+      <w:pPr>
+        <w:pStyle w:val="Body"/>
+        <w:numPr>
+          <w:ilvl w:val="0"/>
+          <w:numId w:val="11"/>
+        </w:numPr>
+        <w:spacing w:before="60" w:after="100"/>
+      </w:pPr>
+      <w:r>
+        <w:t xml:space="preserve">Remove all </w:t>
+      </w:r>
+      <w:proofErr w:type="spellStart"/>
+      <w:r>
+        <w:t>stand alone</w:t>
+      </w:r>
+      <w:proofErr w:type="spellEnd"/>
+      <w:r>
+        <w:t xml:space="preserve"> </w:t>
+      </w:r>
+      <w:proofErr w:type="spellStart"/>
+      <w:r>
+        <w:t>establishNeighborConnectivity</w:t>
+      </w:r>
+      <w:proofErr w:type="spellEnd"/>
+      <w:r>
+        <w:t xml:space="preserve"> functions from high level utilities</w:t>
+      </w:r>
+    </w:p>
+    <w:p>
+      <w:pPr>
+        <w:pStyle w:val="Body"/>
+        <w:numPr>
+          <w:ilvl w:val="0"/>
+          <w:numId w:val="11"/>
+        </w:numPr>
+        <w:spacing w:before="60" w:after="100"/>
+      </w:pPr>
+      <w:r>
+        <w:rPr>
+          <w:i/>
+          <w:iCs/>
+          <w:color w:val="FF2600"/>
+        </w:rPr>
+        <w:t>Removed lower-dim regions must not be part of any computational domain anymore (not-just non-unique regions). This includes the removal of these elements from the parent-element node list of other elements.</w:t>
+      </w:r>
+    </w:p>
+    <w:p>
+      <w:pPr>
+        <w:pStyle w:val="Body"/>
+        <w:numPr>
+          <w:ilvl w:val="0"/>
+          <w:numId w:val="11"/>
+        </w:numPr>
+        <w:spacing w:before="60" w:after="100"/>
+      </w:pPr>
+      <w:r>
+        <w:t>Use a node-based way of identifying which adjacent higher dimensional elements inside the volumetric mesh share faces with lower-dimensional regions</w:t>
+      </w:r>
+    </w:p>
+    <w:p>
+      <w:pPr>
+        <w:pStyle w:val="Body"/>
+        <w:numPr>
+          <w:ilvl w:val="0"/>
+          <w:numId w:val="11"/>
+        </w:numPr>
+        <w:spacing w:before="60" w:after="100"/>
+      </w:pPr>
+      <w:r>
+        <w:t xml:space="preserve">identify the inside and outside parent elements by way of normal directions: if the normal of their corresponding face yields a negative projection, the element is on the outside; else inside. </w:t>
       </w:r>
     </w:p>
     <w:p>
@@ -3440,6 +3527,14 @@
       <w:r>
         <w:t>?</w:t>
       </w:r>
+      <w:r>
+        <w:t xml:space="preserve"> – preferred approach: use PDE operators that are specific to split boundaries in order to compute / accumulate</w:t>
+      </w:r>
+      <w:bookmarkStart w:id="0" w:name="_GoBack"/>
+      <w:bookmarkEnd w:id="0"/>
+      <w:r>
+        <w:t xml:space="preserve"> the coupling terms</w:t>
+      </w:r>
     </w:p>
     <w:p>
       <w:pPr>
@@ -3457,8 +3552,6 @@
       <w:pPr>
         <w:pStyle w:val="Body"/>
       </w:pPr>
-      <w:bookmarkStart w:id="0" w:name="_GoBack"/>
-      <w:bookmarkEnd w:id="0"/>
     </w:p>
     <w:sectPr>
       <w:headerReference w:type="even" r:id="rId7"/>
@@ -3548,21 +3641,11 @@
       </w:rPr>
       <w:t xml:space="preserve"> of </w:t>
     </w:r>
-    <w:r>
-      <w:fldChar w:fldCharType="begin"/>
-    </w:r>
-    <w:r>
-      <w:instrText xml:space="preserve"> NUMPAGES </w:instrText>
-    </w:r>
-    <w:r>
-      <w:fldChar w:fldCharType="separate"/>
-    </w:r>
-    <w:r>
-      <w:t>7</w:t>
-    </w:r>
-    <w:r>
-      <w:fldChar w:fldCharType="end"/>
-    </w:r>
+    <w:fldSimple w:instr=" NUMPAGES ">
+      <w:r>
+        <w:t>7</w:t>
+      </w:r>
+    </w:fldSimple>
   </w:p>
 </w:ftr>
 </file>
@@ -3856,6 +3939,322 @@
     </w:lvl>
   </w:abstractNum>
   <w:abstractNum w:abstractNumId="1" w15:restartNumberingAfterBreak="0">
+    <w:nsid w:val="499650EB"/>
+    <w:multiLevelType w:val="hybridMultilevel"/>
+    <w:tmpl w:val="29FCF080"/>
+    <w:lvl w:ilvl="0" w:tplc="0409000F">
+      <w:start w:val="1"/>
+      <w:numFmt w:val="decimal"/>
+      <w:lvlText w:val="%1."/>
+      <w:lvlJc w:val="left"/>
+      <w:pPr>
+        <w:ind w:left="360" w:hanging="360"/>
+      </w:pPr>
+    </w:lvl>
+    <w:lvl w:ilvl="1" w:tplc="04090019" w:tentative="1">
+      <w:start w:val="1"/>
+      <w:numFmt w:val="lowerLetter"/>
+      <w:lvlText w:val="%2."/>
+      <w:lvlJc w:val="left"/>
+      <w:pPr>
+        <w:ind w:left="1080" w:hanging="360"/>
+      </w:pPr>
+    </w:lvl>
+    <w:lvl w:ilvl="2" w:tplc="0409001B" w:tentative="1">
+      <w:start w:val="1"/>
+      <w:numFmt w:val="lowerRoman"/>
+      <w:lvlText w:val="%3."/>
+      <w:lvlJc w:val="right"/>
+      <w:pPr>
+        <w:ind w:left="1800" w:hanging="180"/>
+      </w:pPr>
+    </w:lvl>
+    <w:lvl w:ilvl="3" w:tplc="0409000F" w:tentative="1">
+      <w:start w:val="1"/>
+      <w:numFmt w:val="decimal"/>
+      <w:lvlText w:val="%4."/>
+      <w:lvlJc w:val="left"/>
+      <w:pPr>
+        <w:ind w:left="2520" w:hanging="360"/>
+      </w:pPr>
+    </w:lvl>
+    <w:lvl w:ilvl="4" w:tplc="04090019" w:tentative="1">
+      <w:start w:val="1"/>
+      <w:numFmt w:val="lowerLetter"/>
+      <w:lvlText w:val="%5."/>
+      <w:lvlJc w:val="left"/>
+      <w:pPr>
+        <w:ind w:left="3240" w:hanging="360"/>
+      </w:pPr>
+    </w:lvl>
+    <w:lvl w:ilvl="5" w:tplc="0409001B" w:tentative="1">
+      <w:start w:val="1"/>
+      <w:numFmt w:val="lowerRoman"/>
+      <w:lvlText w:val="%6."/>
+      <w:lvlJc w:val="right"/>
+      <w:pPr>
+        <w:ind w:left="3960" w:hanging="180"/>
+      </w:pPr>
+    </w:lvl>
+    <w:lvl w:ilvl="6" w:tplc="0409000F" w:tentative="1">
+      <w:start w:val="1"/>
+      <w:numFmt w:val="decimal"/>
+      <w:lvlText w:val="%7."/>
+      <w:lvlJc w:val="left"/>
+      <w:pPr>
+        <w:ind w:left="4680" w:hanging="360"/>
+      </w:pPr>
+    </w:lvl>
+    <w:lvl w:ilvl="7" w:tplc="04090019" w:tentative="1">
+      <w:start w:val="1"/>
+      <w:numFmt w:val="lowerLetter"/>
+      <w:lvlText w:val="%8."/>
+      <w:lvlJc w:val="left"/>
+      <w:pPr>
+        <w:ind w:left="5400" w:hanging="360"/>
+      </w:pPr>
+    </w:lvl>
+    <w:lvl w:ilvl="8" w:tplc="0409001B" w:tentative="1">
+      <w:start w:val="1"/>
+      <w:numFmt w:val="lowerRoman"/>
+      <w:lvlText w:val="%9."/>
+      <w:lvlJc w:val="right"/>
+      <w:pPr>
+        <w:ind w:left="6120" w:hanging="180"/>
+      </w:pPr>
+    </w:lvl>
+  </w:abstractNum>
+  <w:abstractNum w:abstractNumId="2" w15:restartNumberingAfterBreak="0">
+    <w:nsid w:val="49D00453"/>
+    <w:multiLevelType w:val="hybridMultilevel"/>
+    <w:tmpl w:val="131A3DCA"/>
+    <w:lvl w:ilvl="0" w:tplc="BDF6296E">
+      <w:start w:val="1"/>
+      <w:numFmt w:val="decimal"/>
+      <w:lvlText w:val="%1."/>
+      <w:lvlJc w:val="left"/>
+      <w:pPr>
+        <w:ind w:left="360" w:hanging="360"/>
+      </w:pPr>
+      <w:rPr>
+        <w:rFonts w:hAnsi="Arial Unicode MS"/>
+        <w:caps w:val="0"/>
+        <w:smallCaps w:val="0"/>
+        <w:strike w:val="0"/>
+        <w:dstrike w:val="0"/>
+        <w:outline w:val="0"/>
+        <w:emboss w:val="0"/>
+        <w:imprint w:val="0"/>
+        <w:spacing w:val="0"/>
+        <w:w w:val="100"/>
+        <w:kern w:val="0"/>
+        <w:position w:val="0"/>
+        <w:highlight w:val="none"/>
+        <w:vertAlign w:val="baseline"/>
+      </w:rPr>
+    </w:lvl>
+    <w:lvl w:ilvl="1" w:tplc="04090001">
+      <w:start w:val="1"/>
+      <w:numFmt w:val="bullet"/>
+      <w:lvlText w:val=""/>
+      <w:lvlJc w:val="left"/>
+      <w:pPr>
+        <w:ind w:left="720" w:hanging="360"/>
+      </w:pPr>
+      <w:rPr>
+        <w:rFonts w:ascii="Symbol" w:hAnsi="Symbol" w:hint="default"/>
+        <w:caps w:val="0"/>
+        <w:smallCaps w:val="0"/>
+        <w:strike w:val="0"/>
+        <w:dstrike w:val="0"/>
+        <w:outline w:val="0"/>
+        <w:emboss w:val="0"/>
+        <w:imprint w:val="0"/>
+        <w:spacing w:val="0"/>
+        <w:w w:val="100"/>
+        <w:kern w:val="0"/>
+        <w:position w:val="0"/>
+        <w:highlight w:val="none"/>
+        <w:vertAlign w:val="baseline"/>
+      </w:rPr>
+    </w:lvl>
+    <w:lvl w:ilvl="2" w:tplc="D0E0AEE4">
+      <w:start w:val="1"/>
+      <w:numFmt w:val="decimal"/>
+      <w:lvlText w:val="%3."/>
+      <w:lvlJc w:val="left"/>
+      <w:pPr>
+        <w:ind w:left="1080" w:hanging="360"/>
+      </w:pPr>
+      <w:rPr>
+        <w:rFonts w:hAnsi="Arial Unicode MS"/>
+        <w:caps w:val="0"/>
+        <w:smallCaps w:val="0"/>
+        <w:strike w:val="0"/>
+        <w:dstrike w:val="0"/>
+        <w:outline w:val="0"/>
+        <w:emboss w:val="0"/>
+        <w:imprint w:val="0"/>
+        <w:spacing w:val="0"/>
+        <w:w w:val="100"/>
+        <w:kern w:val="0"/>
+        <w:position w:val="0"/>
+        <w:highlight w:val="none"/>
+        <w:vertAlign w:val="baseline"/>
+      </w:rPr>
+    </w:lvl>
+    <w:lvl w:ilvl="3" w:tplc="0F489924">
+      <w:start w:val="1"/>
+      <w:numFmt w:val="decimal"/>
+      <w:lvlText w:val="%4."/>
+      <w:lvlJc w:val="left"/>
+      <w:pPr>
+        <w:ind w:left="1440" w:hanging="360"/>
+      </w:pPr>
+      <w:rPr>
+        <w:rFonts w:hAnsi="Arial Unicode MS"/>
+        <w:caps w:val="0"/>
+        <w:smallCaps w:val="0"/>
+        <w:strike w:val="0"/>
+        <w:dstrike w:val="0"/>
+        <w:outline w:val="0"/>
+        <w:emboss w:val="0"/>
+        <w:imprint w:val="0"/>
+        <w:spacing w:val="0"/>
+        <w:w w:val="100"/>
+        <w:kern w:val="0"/>
+        <w:position w:val="0"/>
+        <w:highlight w:val="none"/>
+        <w:vertAlign w:val="baseline"/>
+      </w:rPr>
+    </w:lvl>
+    <w:lvl w:ilvl="4" w:tplc="8A88F16E">
+      <w:start w:val="1"/>
+      <w:numFmt w:val="decimal"/>
+      <w:lvlText w:val="%5."/>
+      <w:lvlJc w:val="left"/>
+      <w:pPr>
+        <w:ind w:left="1800" w:hanging="360"/>
+      </w:pPr>
+      <w:rPr>
+        <w:rFonts w:hAnsi="Arial Unicode MS"/>
+        <w:caps w:val="0"/>
+        <w:smallCaps w:val="0"/>
+        <w:strike w:val="0"/>
+        <w:dstrike w:val="0"/>
+        <w:outline w:val="0"/>
+        <w:emboss w:val="0"/>
+        <w:imprint w:val="0"/>
+        <w:spacing w:val="0"/>
+        <w:w w:val="100"/>
+        <w:kern w:val="0"/>
+        <w:position w:val="0"/>
+        <w:highlight w:val="none"/>
+        <w:vertAlign w:val="baseline"/>
+      </w:rPr>
+    </w:lvl>
+    <w:lvl w:ilvl="5" w:tplc="A62A1206">
+      <w:start w:val="1"/>
+      <w:numFmt w:val="decimal"/>
+      <w:lvlText w:val="%6."/>
+      <w:lvlJc w:val="left"/>
+      <w:pPr>
+        <w:ind w:left="2160" w:hanging="360"/>
+      </w:pPr>
+      <w:rPr>
+        <w:rFonts w:hAnsi="Arial Unicode MS"/>
+        <w:caps w:val="0"/>
+        <w:smallCaps w:val="0"/>
+        <w:strike w:val="0"/>
+        <w:dstrike w:val="0"/>
+        <w:outline w:val="0"/>
+        <w:emboss w:val="0"/>
+        <w:imprint w:val="0"/>
+        <w:spacing w:val="0"/>
+        <w:w w:val="100"/>
+        <w:kern w:val="0"/>
+        <w:position w:val="0"/>
+        <w:highlight w:val="none"/>
+        <w:vertAlign w:val="baseline"/>
+      </w:rPr>
+    </w:lvl>
+    <w:lvl w:ilvl="6" w:tplc="F522E2D0">
+      <w:start w:val="1"/>
+      <w:numFmt w:val="decimal"/>
+      <w:lvlText w:val="%7."/>
+      <w:lvlJc w:val="left"/>
+      <w:pPr>
+        <w:ind w:left="2520" w:hanging="360"/>
+      </w:pPr>
+      <w:rPr>
+        <w:rFonts w:hAnsi="Arial Unicode MS"/>
+        <w:caps w:val="0"/>
+        <w:smallCaps w:val="0"/>
+        <w:strike w:val="0"/>
+        <w:dstrike w:val="0"/>
+        <w:outline w:val="0"/>
+        <w:emboss w:val="0"/>
+        <w:imprint w:val="0"/>
+        <w:spacing w:val="0"/>
+        <w:w w:val="100"/>
+        <w:kern w:val="0"/>
+        <w:position w:val="0"/>
+        <w:highlight w:val="none"/>
+        <w:vertAlign w:val="baseline"/>
+      </w:rPr>
+    </w:lvl>
+    <w:lvl w:ilvl="7" w:tplc="EB1051DE">
+      <w:start w:val="1"/>
+      <w:numFmt w:val="decimal"/>
+      <w:lvlText w:val="%8."/>
+      <w:lvlJc w:val="left"/>
+      <w:pPr>
+        <w:ind w:left="2880" w:hanging="360"/>
+      </w:pPr>
+      <w:rPr>
+        <w:rFonts w:hAnsi="Arial Unicode MS"/>
+        <w:caps w:val="0"/>
+        <w:smallCaps w:val="0"/>
+        <w:strike w:val="0"/>
+        <w:dstrike w:val="0"/>
+        <w:outline w:val="0"/>
+        <w:emboss w:val="0"/>
+        <w:imprint w:val="0"/>
+        <w:spacing w:val="0"/>
+        <w:w w:val="100"/>
+        <w:kern w:val="0"/>
+        <w:position w:val="0"/>
+        <w:highlight w:val="none"/>
+        <w:vertAlign w:val="baseline"/>
+      </w:rPr>
+    </w:lvl>
+    <w:lvl w:ilvl="8" w:tplc="2FDA1400">
+      <w:start w:val="1"/>
+      <w:numFmt w:val="decimal"/>
+      <w:lvlText w:val="%9."/>
+      <w:lvlJc w:val="left"/>
+      <w:pPr>
+        <w:ind w:left="3240" w:hanging="360"/>
+      </w:pPr>
+      <w:rPr>
+        <w:rFonts w:hAnsi="Arial Unicode MS"/>
+        <w:caps w:val="0"/>
+        <w:smallCaps w:val="0"/>
+        <w:strike w:val="0"/>
+        <w:dstrike w:val="0"/>
+        <w:outline w:val="0"/>
+        <w:emboss w:val="0"/>
+        <w:imprint w:val="0"/>
+        <w:spacing w:val="0"/>
+        <w:w w:val="100"/>
+        <w:kern w:val="0"/>
+        <w:position w:val="0"/>
+        <w:highlight w:val="none"/>
+        <w:vertAlign w:val="baseline"/>
+      </w:rPr>
+    </w:lvl>
+  </w:abstractNum>
+  <w:abstractNum w:abstractNumId="3" w15:restartNumberingAfterBreak="0">
     <w:nsid w:val="4F8C75B2"/>
     <w:multiLevelType w:val="hybridMultilevel"/>
     <w:tmpl w:val="23C0C8B6"/>
@@ -4086,19 +4485,19 @@
       </w:rPr>
     </w:lvl>
   </w:abstractNum>
-  <w:abstractNum w:abstractNumId="2" w15:restartNumberingAfterBreak="0">
+  <w:abstractNum w:abstractNumId="4" w15:restartNumberingAfterBreak="0">
     <w:nsid w:val="56222E15"/>
     <w:multiLevelType w:val="hybridMultilevel"/>
     <w:tmpl w:val="7A0C7B3A"/>
     <w:numStyleLink w:val="BulletBig"/>
   </w:abstractNum>
-  <w:abstractNum w:abstractNumId="3" w15:restartNumberingAfterBreak="0">
+  <w:abstractNum w:abstractNumId="5" w15:restartNumberingAfterBreak="0">
     <w:nsid w:val="5B26179F"/>
     <w:multiLevelType w:val="hybridMultilevel"/>
     <w:tmpl w:val="23C0C8B6"/>
     <w:numStyleLink w:val="Lettered"/>
   </w:abstractNum>
-  <w:abstractNum w:abstractNumId="4" w15:restartNumberingAfterBreak="0">
+  <w:abstractNum w:abstractNumId="6" w15:restartNumberingAfterBreak="0">
     <w:nsid w:val="5D7938EB"/>
     <w:multiLevelType w:val="hybridMultilevel"/>
     <w:tmpl w:val="94AAD610"/>
@@ -4211,13 +4610,13 @@
       </w:rPr>
     </w:lvl>
   </w:abstractNum>
-  <w:abstractNum w:abstractNumId="5" w15:restartNumberingAfterBreak="0">
+  <w:abstractNum w:abstractNumId="7" w15:restartNumberingAfterBreak="0">
     <w:nsid w:val="5FD1252B"/>
     <w:multiLevelType w:val="hybridMultilevel"/>
     <w:tmpl w:val="BC524E12"/>
     <w:numStyleLink w:val="Numbered"/>
   </w:abstractNum>
-  <w:abstractNum w:abstractNumId="6" w15:restartNumberingAfterBreak="0">
+  <w:abstractNum w:abstractNumId="8" w15:restartNumberingAfterBreak="0">
     <w:nsid w:val="6A4535AA"/>
     <w:multiLevelType w:val="hybridMultilevel"/>
     <w:tmpl w:val="D840948C"/>
@@ -4449,7 +4848,7 @@
       </w:rPr>
     </w:lvl>
   </w:abstractNum>
-  <w:abstractNum w:abstractNumId="7" w15:restartNumberingAfterBreak="0">
+  <w:abstractNum w:abstractNumId="9" w15:restartNumberingAfterBreak="0">
     <w:nsid w:val="6C1539F2"/>
     <w:multiLevelType w:val="hybridMultilevel"/>
     <w:tmpl w:val="7A0C7B3A"/>
@@ -4698,7 +5097,7 @@
       </w:rPr>
     </w:lvl>
   </w:abstractNum>
-  <w:abstractNum w:abstractNumId="8" w15:restartNumberingAfterBreak="0">
+  <w:abstractNum w:abstractNumId="10" w15:restartNumberingAfterBreak="0">
     <w:nsid w:val="7C98246F"/>
     <w:multiLevelType w:val="hybridMultilevel"/>
     <w:tmpl w:val="EC44AD86"/>
@@ -4812,40 +5211,40 @@
     </w:lvl>
   </w:abstractNum>
   <w:num w:numId="1">
-    <w:abstractNumId w:val="6"/>
+    <w:abstractNumId w:val="8"/>
   </w:num>
   <w:num w:numId="2">
-    <w:abstractNumId w:val="7"/>
+    <w:abstractNumId w:val="9"/>
   </w:num>
   <w:num w:numId="3">
-    <w:abstractNumId w:val="2"/>
+    <w:abstractNumId w:val="4"/>
   </w:num>
   <w:num w:numId="4">
     <w:abstractNumId w:val="0"/>
   </w:num>
   <w:num w:numId="5">
-    <w:abstractNumId w:val="5"/>
+    <w:abstractNumId w:val="7"/>
   </w:num>
   <w:num w:numId="6">
-    <w:abstractNumId w:val="5"/>
+    <w:abstractNumId w:val="7"/>
     <w:lvlOverride w:ilvl="0">
       <w:startOverride w:val="1"/>
     </w:lvlOverride>
   </w:num>
   <w:num w:numId="7">
-    <w:abstractNumId w:val="5"/>
+    <w:abstractNumId w:val="7"/>
     <w:lvlOverride w:ilvl="0">
       <w:startOverride w:val="1"/>
     </w:lvlOverride>
   </w:num>
   <w:num w:numId="8">
-    <w:abstractNumId w:val="5"/>
+    <w:abstractNumId w:val="7"/>
     <w:lvlOverride w:ilvl="0">
       <w:startOverride w:val="1"/>
     </w:lvlOverride>
   </w:num>
   <w:num w:numId="9">
-    <w:abstractNumId w:val="6"/>
+    <w:abstractNumId w:val="8"/>
     <w:lvlOverride w:ilvl="0">
       <w:lvl w:ilvl="0" w:tplc="3F60C0F6">
         <w:start w:val="1"/>
@@ -5091,15 +5490,15 @@
     </w:lvlOverride>
   </w:num>
   <w:num w:numId="10">
-    <w:abstractNumId w:val="1"/>
+    <w:abstractNumId w:val="3"/>
   </w:num>
   <w:num w:numId="11">
-    <w:abstractNumId w:val="3"/>
+    <w:abstractNumId w:val="5"/>
   </w:num>
   <w:num w:numId="12">
-    <w:abstractNumId w:val="2"/>
+    <w:abstractNumId w:val="4"/>
     <w:lvlOverride w:ilvl="0">
-      <w:lvl w:ilvl="0" w:tplc="AAB805FC">
+      <w:lvl w:ilvl="0" w:tplc="92E85468">
         <w:start w:val="1"/>
         <w:numFmt w:val="bullet"/>
         <w:lvlText w:val="•"/>
@@ -5130,7 +5529,7 @@
       </w:lvl>
     </w:lvlOverride>
     <w:lvlOverride w:ilvl="1">
-      <w:lvl w:ilvl="1" w:tplc="FFF86E28">
+      <w:lvl w:ilvl="1" w:tplc="97007BF6">
         <w:start w:val="1"/>
         <w:numFmt w:val="bullet"/>
         <w:lvlText w:val="•"/>
@@ -5161,7 +5560,7 @@
       </w:lvl>
     </w:lvlOverride>
     <w:lvlOverride w:ilvl="2">
-      <w:lvl w:ilvl="2" w:tplc="7A50B99C">
+      <w:lvl w:ilvl="2" w:tplc="0392534C">
         <w:start w:val="1"/>
         <w:numFmt w:val="bullet"/>
         <w:lvlText w:val="•"/>
@@ -5192,7 +5591,7 @@
       </w:lvl>
     </w:lvlOverride>
     <w:lvlOverride w:ilvl="3">
-      <w:lvl w:ilvl="3" w:tplc="1902DC64">
+      <w:lvl w:ilvl="3" w:tplc="1B76FFBA">
         <w:start w:val="1"/>
         <w:numFmt w:val="bullet"/>
         <w:lvlText w:val="•"/>
@@ -5223,7 +5622,7 @@
       </w:lvl>
     </w:lvlOverride>
     <w:lvlOverride w:ilvl="4">
-      <w:lvl w:ilvl="4" w:tplc="9B8826DA">
+      <w:lvl w:ilvl="4" w:tplc="3C0019A6">
         <w:start w:val="1"/>
         <w:numFmt w:val="bullet"/>
         <w:lvlText w:val="•"/>
@@ -5254,7 +5653,7 @@
       </w:lvl>
     </w:lvlOverride>
     <w:lvlOverride w:ilvl="5">
-      <w:lvl w:ilvl="5" w:tplc="C68428E6">
+      <w:lvl w:ilvl="5" w:tplc="6CC67D58">
         <w:start w:val="1"/>
         <w:numFmt w:val="bullet"/>
         <w:lvlText w:val="•"/>
@@ -5285,7 +5684,7 @@
       </w:lvl>
     </w:lvlOverride>
     <w:lvlOverride w:ilvl="6">
-      <w:lvl w:ilvl="6" w:tplc="45D8EE3A">
+      <w:lvl w:ilvl="6" w:tplc="17406944">
         <w:start w:val="1"/>
         <w:numFmt w:val="bullet"/>
         <w:lvlText w:val="•"/>
@@ -5316,7 +5715,7 @@
       </w:lvl>
     </w:lvlOverride>
     <w:lvlOverride w:ilvl="7">
-      <w:lvl w:ilvl="7" w:tplc="B0DEDBCA">
+      <w:lvl w:ilvl="7" w:tplc="F00CBD84">
         <w:start w:val="1"/>
         <w:numFmt w:val="bullet"/>
         <w:lvlText w:val="•"/>
@@ -5347,7 +5746,7 @@
       </w:lvl>
     </w:lvlOverride>
     <w:lvlOverride w:ilvl="8">
-      <w:lvl w:ilvl="8" w:tplc="85D01F02">
+      <w:lvl w:ilvl="8" w:tplc="22DCA1E8">
         <w:start w:val="1"/>
         <w:numFmt w:val="bullet"/>
         <w:lvlText w:val="•"/>
@@ -5379,10 +5778,16 @@
     </w:lvlOverride>
   </w:num>
   <w:num w:numId="13">
-    <w:abstractNumId w:val="4"/>
+    <w:abstractNumId w:val="6"/>
   </w:num>
   <w:num w:numId="14">
-    <w:abstractNumId w:val="8"/>
+    <w:abstractNumId w:val="10"/>
+  </w:num>
+  <w:num w:numId="15">
+    <w:abstractNumId w:val="2"/>
+  </w:num>
+  <w:num w:numId="16">
+    <w:abstractNumId w:val="1"/>
   </w:num>
 </w:numbering>
 </file>
@@ -5410,7 +5815,7 @@
       </w:pPr>
     </w:pPrDefault>
   </w:docDefaults>
-  <w:latentStyles w:defLockedState="0" w:defUIPriority="99" w:defSemiHidden="0" w:defUnhideWhenUsed="0" w:defQFormat="0" w:count="377">
+  <w:latentStyles w:defLockedState="0" w:defUIPriority="99" w:defSemiHidden="0" w:defUnhideWhenUsed="0" w:defQFormat="0" w:count="376">
     <w:lsdException w:name="Normal" w:uiPriority="0" w:qFormat="1"/>
     <w:lsdException w:name="heading 1" w:uiPriority="9" w:qFormat="1"/>
     <w:lsdException w:name="heading 2" w:semiHidden="1" w:uiPriority="9" w:unhideWhenUsed="1" w:qFormat="1"/>
@@ -5787,7 +6192,6 @@
     <w:lsdException w:name="Hashtag" w:semiHidden="1" w:unhideWhenUsed="1"/>
     <w:lsdException w:name="Unresolved Mention" w:semiHidden="1" w:unhideWhenUsed="1"/>
     <w:lsdException w:name="Smart Link" w:semiHidden="1" w:unhideWhenUsed="1"/>
-    <w:lsdException w:name="Smart Link Error" w:semiHidden="1" w:unhideWhenUsed="1"/>
   </w:latentStyles>
   <w:style w:type="paragraph" w:default="1" w:styleId="Normal">
     <w:name w:val="Normal"/>

</xml_diff>